<commit_message>
feat: expose domain administration operations in web workspace
</commit_message>
<xml_diff>
--- a/docs/admin-guide/sambaadm-admin-guide.docx
+++ b/docs/admin-guide/sambaadm-admin-guide.docx
@@ -17,7 +17,7 @@
     </w:p>
     <w:p>
       <w:r>
-        <w:t>Для ALT SP Workstation 10.2.2 на x86-64. Редакция от 19 октября 2026 года. Основа: проект v0.7.1 с исправленной статической сборкой Linux.</w:t>
+        <w:t>Для ALT SP Workstation 10.2.2 на x86-64. Редакция от 19 октября 2026 года. Версия приложения v0.8.0 с деревом каталога и административными формами.</w:t>
       </w:r>
     </w:p>
     <w:p>
@@ -830,7 +830,7 @@
     </w:p>
     <w:p>
       <w:r>
-        <w:t>1. Откройте «Пользователи» и нажмите «+» под ролью admin.</w:t>
+        <w:t>1. Откройте «Пользователи» и нажмите «Создать пользователя» под ролью admin. Заполните форму в открывшемся окне. Альтернативная форма на иллюстрации также доступна по /users/new.</w:t>
       </w:r>
     </w:p>
     <w:p>
@@ -853,7 +853,7 @@
     </w:p>
     <w:p>
       <w:r>
-        <w:t>В списке используйте «Отключить» или «Включить» напротив нужной записи. Сверяйте Login и DN перед действием. Для смены пароля используйте CLI; команда запросит новый пароль интерактивно:</w:t>
+        <w:t>В списке используйте «Отключить» или «Включить» напротив записи. «Сбросить пароль» открывает форму с повторным вводом. Сверяйте логин и DN перед действием. Для CLI новый пароль вводится интерактивно:</w:t>
       </w:r>
     </w:p>
     <w:p>
@@ -878,7 +878,7 @@
     </w:p>
     <w:p>
       <w:r>
-        <w:t>Раздел «Группы» показывает имя, число участников и DN. Управление членством выполняйте через CLI с настроенным конфигом и переменной SAMBAADM_PASSWORD:</w:t>
+        <w:t>В разделе «Группы» доступны свойства, участники, создание и удаление группы. Кнопки «Добавить участника» и «Исключить участника» принимают DN записи. Те же операции доступны через CLI с настроенным конфигом и SAMBAADM_PASSWORD:</w:t>
       </w:r>
     </w:p>
     <w:p>
@@ -1057,7 +1057,7 @@
     </w:p>
     <w:p>
       <w:r>
-        <w:t>«Компьютеры» и OU помогают просматривать объекты каталога. «Домен», «Репликация», «Сайты», DNS и «Доверия» показывают соответствующие сведения. Набор кнопок в веб-интерфейсе ограничен; расширенные действия доступны через CLI и REST API. Справка: sambaadm --help и sambaadm &lt;команда&gt; --help.</w:t>
+        <w:t>Дерево «Компьютеров» и OU позволяет выбирать объекты, переносить и удалять их. «Домен», «Репликация», «Сайты» и «Доверия» содержат формы административных операций. Права проверяются на сервере. Для CLI: sambaadm &lt;команда&gt; --help.</w:t>
       </w:r>
     </w:p>
     <w:p>
@@ -1332,14 +1332,14 @@
     </w:p>
     <w:p>
       <w:r>
-        <w:t>Откройте «Пользователи» (/users). В таблице показаны Login, Name, Status, DN и действие включения или отключения. DN показывает, в каком контейнере или подразделении находится запись.</w:t>
+        <w:t>Откройте «Пользователи» (/users). Слева — раскрывающееся дерево домена, OU, контейнеров и пользователей. Справа — список с логином, именем, состоянием, DN и операциями. Выбор ветви фильтрует список по её объектам и вложенным подразделениям.</w:t>
       </w:r>
     </w:p>
     <w:p>
       <w:r>
         <w:drawing>
           <wp:inline xmlns:a="http://schemas.openxmlformats.org/drawingml/2006/main" xmlns:pic="http://schemas.openxmlformats.org/drawingml/2006/picture">
-            <wp:extent cx="5943600" cy="2080260"/>
+            <wp:extent cx="5943600" cy="2311400"/>
             <wp:docPr id="5" name="Picture 5"/>
             <wp:cNvGraphicFramePr>
               <a:graphicFrameLocks noChangeAspect="1"/>
@@ -1360,7 +1360,7 @@
                   <pic:spPr>
                     <a:xfrm>
                       <a:off x="0" y="0"/>
-                      <a:ext cx="5943600" cy="2080260"/>
+                      <a:ext cx="5943600" cy="2311400"/>
                     </a:xfrm>
                     <a:prstGeom prst="rect"/>
                   </pic:spPr>
@@ -1373,11 +1373,7 @@
     </w:p>
     <w:p>
       <w:r>
-        <w:rPr>
-          <w:i/>
-          <w:sz w:val="18"/>
-        </w:rPr>
-        <w:t>Рисунок 5. Настоящий шаблон списка пользователей с двумя учебными записями.</w:t>
+        <w:t>Рисунок 5. Текущий веб-интерфейс пользователей с учебными данными теста.</w:t>
       </w:r>
     </w:p>
     <w:p>
@@ -1418,11 +1414,7 @@
     </w:p>
     <w:p>
       <w:r>
-        <w:rPr>
-          <w:i/>
-          <w:sz w:val="18"/>
-        </w:rPr>
-        <w:t>Рисунок 6. Как читать иерархию по DN. Это схема, а не существующий экран дерева.</w:t>
+        <w:t>Рисунок 6. Схема размещения объектов. В интерфейсе дерево раскрывается слева.</w:t>
       </w:r>
     </w:p>
     <w:p>
@@ -1435,7 +1427,7 @@
     </w:p>
     <w:p>
       <w:r>
-        <w:t>1. Введите часть логина или имени в поле поиска и нажмите OK. Поиск проверяет sAMAccountName, displayName и cn. Для просмотра одной записи по точному логину используйте CLI user show.</w:t>
+        <w:t>1. Раскройте подразделение слева и выберите контейнер или пользователя. Введите часть имени, логина или DN и нажмите «Найти». Поиск фильтрует загруженный список. «Все объекты» снимает выбор ветви; «Обновить» перечитывает данные.</w:t>
       </w:r>
     </w:p>
     <w:p>
@@ -1445,7 +1437,7 @@
     </w:p>
     <w:p>
       <w:r>
-        <w:t>3. Для структуры подразделений используйте CLI ou tree. Для пользователей выбранного OU используйте user list --ou. Выборка включает вложенные подразделения.</w:t>
+        <w:t>3. Структуру также можно посмотреть через CLI ou tree. Для пользователей OU используйте user list --ou. Выборка включает вложенные подразделения.</w:t>
       </w:r>
     </w:p>
     <w:p>
@@ -1536,7 +1528,7 @@
     </w:p>
     <w:p>
       <w:r>
-        <w:t>В веб-интерфейсе доступны список и создание через «+» для admin. Через CLI можно посмотреть точную запись и создать пользователя с интерактивным вводом пароля:</w:t>
+        <w:t>В веб-интерфейсе выберите «Свойства» для записи или «Создать пользователя» для новой учётной записи. Через CLI можно получить ту же запись и создать пользователя с интерактивным вводом пароля:</w:t>
       </w:r>
     </w:p>
     <w:p>
@@ -1627,7 +1619,7 @@
     </w:p>
     <w:p>
       <w:r>
-        <w:t>Отдельной кнопки сброса в текущем веб-списке нет. Используйте CLI, который запросит новый пароль. Для изменения unicodePwd требуется защищённое подключение LDAPS или локальное ldapi.</w:t>
+        <w:t>Нажмите «Сбросить пароль», введите новый пароль дважды и выполните операцию. Поля очищаются после успеха. Альтернатива — CLI. Для изменения unicodePwd требуется LDAPS или локальное ldapi.</w:t>
       </w:r>
     </w:p>
     <w:p>
@@ -1652,7 +1644,7 @@
     </w:p>
     <w:p>
       <w:r>
-        <w:t>Перемещение меняет DN и может изменить область действия GPO. Проверьте целевой OU, затем перечитайте запись. Для группы используйте актуальный DN после переноса.</w:t>
+        <w:t>Нажмите «Переместить» и выберите или введите целевой OU DN. Перенос может изменить действие GPO. Проверьте новый DN в свойствах. Членство меняется в разделе «Группы» по актуальному DN участника. Эквивалент CLI:</w:t>
       </w:r>
     </w:p>
     <w:p>
@@ -1713,7 +1705,7 @@
     </w:p>
     <w:p>
       <w:r>
-        <w:t>CLI: sa user delete ivanov. Удаление не заменяет отключение и может нарушить доступ по SID. Удаляйте только после проверки заявки и резервного копирования; автоматическое восстановление записью с тем же логином не обеспечивается. В текущем списке отдельной кнопки удаления нет.</w:t>
+        <w:t>Нажмите «Удалить», проверьте выбранную запись и отметьте подтверждение. CLI: sa user delete ivanov. Удаление может нарушить доступ по SID. Удаляйте после проверки заявки и резервного копирования; новая запись с тем же логином не восстанавливает прежний SID.</w:t>
       </w:r>
     </w:p>
     <w:p>
@@ -1781,7 +1773,7 @@
     </w:p>
     <w:p>
       <w:r>
-        <w:t>В разделе DNS (/dns) сейчас отображаются зоны, источник и DN. Раскрытие зоны до записей и формы редактирования записей в веб-интерфейсе не реализованы. Для записей используйте CLI; операции с ними вызывают samba-tool на сервере приложения.</w:t>
+        <w:t>В разделе DNS (/dns) раскройте зону и «Имена записей», выберите имя и нажмите «Показать». Можно запросить имя вручную через «Записи». Дерево использует DNS-разделы LDAP; операции записей — samba-tool на сервере приложения.</w:t>
       </w:r>
     </w:p>
     <w:p>
@@ -1831,7 +1823,7 @@
     </w:p>
     <w:p>
       <w:r>
-        <w:t>До изменения прочитайте существующее значение. update требует прежнее значение --old-data и новое --data. Пример для тестового имени files:</w:t>
+        <w:t>Нажмите «Добавить запись» или «Изменить запись» в строке зоны. Задайте имя, тип и значение; при изменении требуется точное прежнее значение. Сначала прочитайте текущую запись. Пример CLI для тестового имени files:</w:t>
       </w:r>
     </w:p>
     <w:p>
@@ -1952,7 +1944,7 @@
     </w:p>
     <w:p>
       <w:r>
-        <w:t>Выполняйте только нужную операцию. Удаление зоны затрагивает её записи. Не удаляйте служебные зоны и записи домена без отдельного плана. Для изменения нужны samba-tool и соответствующие доменные полномочия.</w:t>
+        <w:t>«Создать зону» находится над списком; удаление записи и зоны — в строке зоны. Выполните только нужную операцию и подтвердите удаление. Не удаляйте служебные данные AD без плана. Нужны samba-tool и полномочия в домене.</w:t>
       </w:r>
     </w:p>
     <w:p>
@@ -2028,7 +2020,7 @@
     </w:p>
     <w:p>
       <w:r>
-        <w:t>Раздел GPO (/gpo) показывает имя, GUID и источник. Для admin доступна кнопка Distribute с подтверждением и панелью статуса. Полного дерева OU с привязками и редактора параметров политики в текущем веб-интерфейсе нет.</w:t>
+        <w:t>В GPO (/gpo) слева показаны политики и домен с OU. Выберите OU для просмотра ссылок. В строке политики доступны свойства, привязка, отмена привязки, резервная копия, восстановление, доставка и удаление. Редактор содержимого Windows-политик в проект не входит.</w:t>
       </w:r>
     </w:p>
     <w:p>
@@ -2077,7 +2069,7 @@
     </w:p>
     <w:p>
       <w:r>
-        <w:t>Сохраните GUID из результата и используйте его вместо &lt;GUID&gt; в следующих командах. Создание объекта не настраивает параметры Windows и не привязывает политику к OU. Для редактирования самих параметров используйте совместимый редактор GPO.</w:t>
+        <w:t>В веб-интерфейсе нажмите «Создать GPO» и задайте имя. Для CLI сохраните GUID из результата. Создание объекта не настраивает параметры Windows и не привязывает его к OU. Для содержимого нужен совместимый редактор GPO.</w:t>
       </w:r>
     </w:p>
     <w:p>
@@ -2138,7 +2130,7 @@
     </w:p>
     <w:p>
       <w:r>
-        <w:t>link добавляет ссылку к контейнеру; unlink снимает её, сохраняя сам объект политики. Используйте только требуемую команду. Проверьте целевой OU, состав компьютеров и пользователей, наследование и фильтрацию политики.</w:t>
+        <w:t>В строке GPO выберите «Привязать к OU» или «Отвязать от OU» и укажите DN. Отмена привязки сохраняет политику. Для просмотра выберите OU слева. Проверьте состав объектов, наследование и фильтрацию.</w:t>
       </w:r>
     </w:p>
     <w:p>
@@ -2175,7 +2167,7 @@
     </w:p>
     <w:p>
       <w:r>
-        <w:t>Пути относятся к серверу приложения. Восстановление выполняйте после проверки состава и актуальности копии. Для операций GPO необходимы samba-tool и подходящие полномочия.</w:t>
+        <w:t>Кнопки «Резервная копия» и «Восстановить» принимают каталог на сервере приложения. Проверьте состав и актуальность копии до восстановления. Для операций нужны samba-tool и подходящие полномочия.</w:t>
       </w:r>
     </w:p>
     <w:p>
@@ -2200,7 +2192,7 @@
     </w:p>
     <w:p>
       <w:r>
-        <w:t>Либо нажмите Distribute в веб-интерфейсе. Проверьте все шаги задания: DRS, rsync и ACL в зависимости от конфигурации. Доставка файлов не подтверждает применение политики клиентом: отдельно проверьте репликацию, доступ к SYSVOL и результат применения на целевой Windows-машине, например через gpresult /r.</w:t>
+        <w:t>Либо нажмите «Доставить на контроллеры», подтвердите операцию и наблюдайте ход задания. Закрытие окна не отменяет доставку. Проверьте DRS, rsync и ACL. Применение на Windows-клиенте подтверждается отдельно, например через gpresult /r.</w:t>
       </w:r>
     </w:p>
     <w:p>

</xml_diff>

<commit_message>
Validate real Samba workflows and fix GPO operations and administrator login
</commit_message>
<xml_diff>
--- a/docs/admin-guide/sambaadm-admin-guide.docx
+++ b/docs/admin-guide/sambaadm-admin-guide.docx
@@ -1619,7 +1619,7 @@
     </w:p>
     <w:p>
       <w:r>
-        <w:t>Нажмите «Сбросить пароль», введите новый пароль дважды и выполните операцию. Поля очищаются после успеха. Альтернатива — CLI. Для изменения unicodePwd требуется LDAPS или локальное ldapi.</w:t>
+        <w:t>Нажмите «Сбросить пароль», введите новый пароль дважды и выполните операцию. Поля очищаются после успеха. Для изменения unicodePwd используйте LDAPS с доверенным сертификатом. Samba может отклонять simple bind через ldapi.</w:t>
       </w:r>
     </w:p>
     <w:p>
@@ -2020,7 +2020,7 @@
     </w:p>
     <w:p>
       <w:r>
-        <w:t>В GPO (/gpo) слева показаны политики и домен с OU. Выберите OU для просмотра ссылок. В строке политики доступны свойства, привязка, отмена привязки, резервная копия, восстановление, доставка и удаление. Редактор содержимого Windows-политик в проект не входит.</w:t>
+        <w:t>В GPO (/gpo) слева показаны политики и домен с OU. Выберите OU для просмотра ссылок. В строке доступны свойства, привязка, отмена привязки, резервная копия, доставка и удаление. Восстановление новой GPO доступно на верхней панели.</w:t>
       </w:r>
     </w:p>
     <w:p>
@@ -2162,12 +2162,12 @@
           <w:rFonts w:ascii="Courier New" w:hAnsi="Courier New"/>
           <w:sz w:val="17"/>
         </w:rPr>
-        <w:t>sa gpo restore "&lt;GUID&gt;" --path=/srv/backup/gpo</w:t>
+        <w:t>sa gpo restore "Новая политика" --path=/srv/backup/gpo/policy/{GUID}</w:t>
       </w:r>
     </w:p>
     <w:p>
       <w:r>
-        <w:t>Кнопки «Резервная копия» и «Восстановить» принимают каталог на сервере приложения. Проверьте состав и актуальность копии до восстановления. Для операций нужны samba-tool и подходящие полномочия.</w:t>
+        <w:t>Копия сохраняется в &lt;каталог&gt;/policy/{GUID} на сервере. Нажмите «Восстановить в новую GPO», укажите новое имя и путь к этой папке. Создаётся новая политика с новым GUID; ссылки на OU добавьте отдельно. Нужны samba-tool и подходящие полномочия.</w:t>
       </w:r>
     </w:p>
     <w:p>
@@ -2192,7 +2192,7 @@
     </w:p>
     <w:p>
       <w:r>
-        <w:t>Либо нажмите «Доставить на контроллеры», подтвердите операцию и наблюдайте ход задания. Закрытие окна не отменяет доставку. Проверьте DRS, rsync и ACL. Применение на Windows-клиенте подтверждается отдельно, например через gpresult /r.</w:t>
+        <w:t>Либо нажмите «Доставить на контроллеры», подтвердите операцию и наблюдайте ход задания. Закрытие окна не отменяет доставку. Проверьте DRS, rsync и ACL. Применение на клиенте проверяется отдельно: на ALT используйте gpupdate и gpresult. Совместимость с СП 10.2.2 ещё требует проверки.</w:t>
       </w:r>
     </w:p>
     <w:p>

</xml_diff>

<commit_message>
Add ALT systemd GPO editor with revision checks and recovery journal
</commit_message>
<xml_diff>
--- a/docs/admin-guide/sambaadm-admin-guide.docx
+++ b/docs/admin-guide/sambaadm-admin-guide.docx
@@ -2198,6 +2198,126 @@
     <w:p>
       <w:r>
         <w:t>Удаление: sa gpo delete "&lt;GUID&gt;". Это удаляет объект политики, а не только ссылку. Сначала сохраните копию и проверьте, где политика используется.</w:t>
+      </w:r>
+    </w:p>
+    <w:p>
+      <w:r>
+        <w:br w:type="page"/>
+      </w:r>
+    </w:p>
+    <w:p>
+      <w:pPr>
+        <w:pStyle w:val="Heading1"/>
+      </w:pPr>
+      <w:r>
+        <w:t>Параметры служб ALT Linux</w:t>
+      </w:r>
+    </w:p>
+    <w:p>
+      <w:r>
+        <w:t>Редактор задаёт машинные политики systemd из установленного шаблона ALT. Остальные записи Registry.pol сохраняются. Применение настройки на ALT СП 10.2.2 ещё требует проверки на клиенте.</w:t>
+      </w:r>
+    </w:p>
+    <w:p>
+      <w:r>
+        <w:drawing>
+          <wp:inline xmlns:a="http://schemas.openxmlformats.org/drawingml/2006/main" xmlns:pic="http://schemas.openxmlformats.org/drawingml/2006/picture">
+            <wp:extent cx="5852160" cy="4064000"/>
+            <wp:docPr id="9" name="Picture 9"/>
+            <wp:cNvGraphicFramePr>
+              <a:graphicFrameLocks noChangeAspect="1"/>
+            </wp:cNvGraphicFramePr>
+            <a:graphic>
+              <a:graphicData uri="http://schemas.openxmlformats.org/drawingml/2006/picture">
+                <pic:pic>
+                  <pic:nvPicPr>
+                    <pic:cNvPr id="0" name="alt-editor.png"/>
+                    <pic:cNvPicPr/>
+                  </pic:nvPicPr>
+                  <pic:blipFill>
+                    <a:blip r:embed="rId18"/>
+                    <a:stretch>
+                      <a:fillRect/>
+                    </a:stretch>
+                  </pic:blipFill>
+                  <pic:spPr>
+                    <a:xfrm>
+                      <a:off x="0" y="0"/>
+                      <a:ext cx="5852160" cy="4064000"/>
+                    </a:xfrm>
+                    <a:prstGeom prst="rect"/>
+                  </pic:spPr>
+                </pic:pic>
+              </a:graphicData>
+            </a:graphic>
+          </wp:inline>
+        </w:drawing>
+      </w:r>
+    </w:p>
+    <w:p>
+      <w:pPr>
+        <w:pStyle w:val="Caption"/>
+      </w:pPr>
+      <w:r>
+        <w:t>Рисунок 9. Редактор на учебных данных после сохранения настройки chronyd.service.</w:t>
+      </w:r>
+    </w:p>
+    <w:p>
+      <w:pPr>
+        <w:pStyle w:val="Heading2"/>
+      </w:pPr>
+      <w:r>
+        <w:t>Подготовка сервера</w:t>
+      </w:r>
+    </w:p>
+    <w:p>
+      <w:r>
+        <w:t>Работайте на writable DC с локальным SYSVOL. Укажите в конфигурации gpo.editor_enabled: true, gpo.admx_path: путь к установленному BaseALTSystemdUnits.admx и gpo.sysvol_path: путь к SYSVOL. LDAP должен указывать на этот же DC. По умолчанию редактор отключён; на Mac без локального SYSVOL он недоступен.</w:t>
+      </w:r>
+    </w:p>
+    <w:p>
+      <w:pPr>
+        <w:pStyle w:val="Heading2"/>
+      </w:pPr>
+      <w:r>
+        <w:t>Изменение политики</w:t>
+      </w:r>
+    </w:p>
+    <w:p>
+      <w:pPr>
+        <w:pStyle w:val="ListNumber"/>
+      </w:pPr>
+      <w:r>
+        <w:t>Откройте GPO и нажмите «Параметры ALT» у нужной политики.</w:t>
+      </w:r>
+    </w:p>
+    <w:p>
+      <w:pPr>
+        <w:pStyle w:val="ListNumber"/>
+      </w:pPr>
+      <w:r>
+        <w:t>Выберите службу и состояние: «Включено» — автозапуск, «Отключено» — отключение автозапуска, «Не настроено» — отсутствие этого параметра в GPO.</w:t>
+      </w:r>
+    </w:p>
+    <w:p>
+      <w:pPr>
+        <w:pStyle w:val="ListNumber"/>
+      </w:pPr>
+      <w:r>
+        <w:t>Отметьте подтверждение и нажмите «Сохранить». Сохранять может admin; другим ролям доступен просмотр. При конфликте перезагрузите параметры.</w:t>
+      </w:r>
+    </w:p>
+    <w:p>
+      <w:pPr>
+        <w:pStyle w:val="ListNumber"/>
+      </w:pPr>
+      <w:r>
+        <w:t>Привяжите GPO к OU с компьютером ALT. Проверьте gpupdate и gpresult на клиенте, затем фактическое состояние службы.</w:t>
+      </w:r>
+    </w:p>
+    <w:p>
+      <w:r>
+        <w:t>Не редактируйте ту же политику одновременно в GPUI. Если остался файл .sambaadm-editor.pending, сохранение блокируется до проверки LDAP и файлов SYSVOL. Порядок восстановления описан в docs/web.md. Доставка файлов и успешное сохранение не подтверждают применение настройки на клиенте.</w:t>
       </w:r>
     </w:p>
     <w:sectPr>

</xml_diff>

<commit_message>
Add editable user profiles and direct and primary group membership views
</commit_message>
<xml_diff>
--- a/docs/admin-guide/sambaadm-admin-guide.docx
+++ b/docs/admin-guide/sambaadm-admin-guide.docx
@@ -2318,6 +2318,112 @@
     <w:p>
       <w:r>
         <w:t>Не редактируйте ту же политику одновременно в GPUI. Если остался файл .sambaadm-editor.pending, сохранение блокируется до проверки LDAP и файлов SYSVOL. Порядок восстановления описан в docs/web.md. Доставка файлов и успешное сохранение не подтверждают применение настройки на клиенте.</w:t>
+      </w:r>
+    </w:p>
+    <w:p>
+      <w:r>
+        <w:br w:type="page"/>
+      </w:r>
+    </w:p>
+    <w:p>
+      <w:pPr>
+        <w:pStyle w:val="Heading1"/>
+      </w:pPr>
+      <w:r>
+        <w:t>Карточка пользователя</w:t>
+      </w:r>
+    </w:p>
+    <w:p>
+      <w:r>
+        <w:t>В разделе «Пользователи» нажмите «Свойства». Вкладка «Атрибуты» содержит основные данные и действия над учётной записью; вкладка «Группы» показывает прямое членство и основную группу AD.</w:t>
+      </w:r>
+    </w:p>
+    <w:p>
+      <w:r>
+        <w:drawing>
+          <wp:inline xmlns:a="http://schemas.openxmlformats.org/drawingml/2006/main" xmlns:pic="http://schemas.openxmlformats.org/drawingml/2006/picture">
+            <wp:extent cx="5577840" cy="3873500"/>
+            <wp:docPr id="10" name="Picture 10"/>
+            <wp:cNvGraphicFramePr>
+              <a:graphicFrameLocks noChangeAspect="1"/>
+            </wp:cNvGraphicFramePr>
+            <a:graphic>
+              <a:graphicData uri="http://schemas.openxmlformats.org/drawingml/2006/picture">
+                <pic:pic>
+                  <pic:nvPicPr>
+                    <pic:cNvPr id="0" name="user-profile.png"/>
+                    <pic:cNvPicPr/>
+                  </pic:nvPicPr>
+                  <pic:blipFill>
+                    <a:blip r:embed="rId19"/>
+                    <a:stretch>
+                      <a:fillRect/>
+                    </a:stretch>
+                  </pic:blipFill>
+                  <pic:spPr>
+                    <a:xfrm>
+                      <a:off x="0" y="0"/>
+                      <a:ext cx="5577840" cy="3873500"/>
+                    </a:xfrm>
+                    <a:prstGeom prst="rect"/>
+                  </pic:spPr>
+                </pic:pic>
+              </a:graphicData>
+            </a:graphic>
+          </wp:inline>
+        </w:drawing>
+      </w:r>
+    </w:p>
+    <w:p>
+      <w:pPr>
+        <w:pStyle w:val="Caption"/>
+      </w:pPr>
+      <w:r>
+        <w:t>Рисунок 10. Карточка пользователя на учебных данных. Для групп выберите отдельную вкладку.</w:t>
+      </w:r>
+    </w:p>
+    <w:p>
+      <w:pPr>
+        <w:pStyle w:val="Heading2"/>
+      </w:pPr>
+      <w:r>
+        <w:t>Атрибуты и состояние</w:t>
+      </w:r>
+    </w:p>
+    <w:p>
+      <w:r>
+        <w:t>Admin может изменить имя, фамилию, отображаемое имя, почту, телефон, подразделение организации, должность и описание. Нажмите «Сохранить атрибуты». Пустое поле очищает соответствующий атрибут. Логин, UPN и DN доступны для просмотра; переименования эта форма не выполняет.</w:t>
+      </w:r>
+    </w:p>
+    <w:p>
+      <w:r>
+        <w:t>«Подразделение организации» задаёт текстовый атрибут department. Для переноса в OU используйте «Переместить». Helpdesk может включать и отключать учётную запись и сбрасывать пароль; редактирование атрибутов ему недоступно.</w:t>
+      </w:r>
+    </w:p>
+    <w:p>
+      <w:pPr>
+        <w:pStyle w:val="Heading2"/>
+      </w:pPr>
+      <w:r>
+        <w:t>Членство в группах</w:t>
+      </w:r>
+    </w:p>
+    <w:p>
+      <w:r>
+        <w:t>Перейдите на вкладку «Группы». Admin может найти группу по имени и добавить пользователя либо исключить его из прямой группы. Эти действия применяются сразу. Основная группа помечена отдельно и не имеет кнопки исключения. Вложенные группы не разворачиваются.</w:t>
+      </w:r>
+    </w:p>
+    <w:p>
+      <w:pPr>
+        <w:pStyle w:val="Heading2"/>
+      </w:pPr>
+      <w:r>
+        <w:t>Конфликт изменений</w:t>
+      </w:r>
+    </w:p>
+    <w:p>
+      <w:r>
+        <w:t>Если другой администратор уже изменил запись, сохранение блокируется. Введённые значения остаются в форме: сохраните нужные данные, нажмите «Перезагрузить карточку», сравните изменения и повторите редактирование. Изменения атрибутов и групп попадают в аудит.</w:t>
       </w:r>
     </w:p>
     <w:sectPr>

</xml_diff>

<commit_message>
Add site topology and replication management with two-DC validation
</commit_message>
<xml_diff>
--- a/docs/admin-guide/sambaadm-admin-guide.docx
+++ b/docs/admin-guide/sambaadm-admin-guide.docx
@@ -2424,6 +2424,274 @@
     <w:p>
       <w:r>
         <w:t>Если другой администратор уже изменил запись, сохранение блокируется. Введённые значения остаются в форме: сохраните нужные данные, нажмите «Перезагрузить карточку», сравните изменения и повторите редактирование. Изменения атрибутов и групп попадают в аудит.</w:t>
+      </w:r>
+    </w:p>
+    <w:p>
+      <w:r>
+        <w:br w:type="page"/>
+      </w:r>
+    </w:p>
+    <w:p>
+      <w:pPr>
+        <w:pStyle w:val="Heading1"/>
+      </w:pPr>
+      <w:r>
+        <w:t>Сайты и контроллеры</w:t>
+      </w:r>
+    </w:p>
+    <w:p>
+      <w:r>
+        <w:t>Дополнение к версии 0.11.0. Откройте «Сайты → Топология сайтов»: дерево показывает контроллеры и подсети каждого сайта. Иллюстрации используют учебные данные, а не рабочий домен.</w:t>
+      </w:r>
+    </w:p>
+    <w:p>
+      <w:r>
+        <w:drawing>
+          <wp:inline xmlns:a="http://schemas.openxmlformats.org/drawingml/2006/main" xmlns:pic="http://schemas.openxmlformats.org/drawingml/2006/picture">
+            <wp:extent cx="5760720" cy="4000500"/>
+            <wp:docPr id="11" name="Picture 11"/>
+            <wp:cNvGraphicFramePr>
+              <a:graphicFrameLocks noChangeAspect="1"/>
+            </wp:cNvGraphicFramePr>
+            <a:graphic>
+              <a:graphicData uri="http://schemas.openxmlformats.org/drawingml/2006/picture">
+                <pic:pic>
+                  <pic:nvPicPr>
+                    <pic:cNvPr id="0" name="v0110-site-topology.png"/>
+                    <pic:cNvPicPr/>
+                  </pic:nvPicPr>
+                  <pic:blipFill>
+                    <a:blip r:embed="rId20"/>
+                    <a:stretch>
+                      <a:fillRect/>
+                    </a:stretch>
+                  </pic:blipFill>
+                  <pic:spPr>
+                    <a:xfrm>
+                      <a:off x="0" y="0"/>
+                      <a:ext cx="5760720" cy="4000500"/>
+                    </a:xfrm>
+                    <a:prstGeom prst="rect"/>
+                  </pic:spPr>
+                </pic:pic>
+              </a:graphicData>
+            </a:graphic>
+          </wp:inline>
+        </w:drawing>
+      </w:r>
+    </w:p>
+    <w:p>
+      <w:pPr>
+        <w:pStyle w:val="Caption"/>
+      </w:pPr>
+      <w:r>
+        <w:t>Рисунок 11. Сайты с контроллерами и подсетями.</w:t>
+      </w:r>
+    </w:p>
+    <w:p>
+      <w:pPr>
+        <w:pStyle w:val="Heading2"/>
+      </w:pPr>
+      <w:r>
+        <w:t>Перенос контроллера</w:t>
+      </w:r>
+    </w:p>
+    <w:p>
+      <w:r>
+        <w:t>Создайте целевой сайт. Откройте «Контроллеры», выберите сервер и нажмите «Перенести в сайт». Укажите существующий сайт и подтвердите операцию. Затем заново откройте список и проверьте размещение. Изменения Configuration должны дойти до остальных DC перед пересчётом их топологии.</w:t>
+      </w:r>
+    </w:p>
+    <w:p>
+      <w:pPr>
+        <w:pStyle w:val="Heading2"/>
+      </w:pPr>
+      <w:r>
+        <w:t>Подсети и удаление сайта</w:t>
+      </w:r>
+    </w:p>
+    <w:p>
+      <w:r>
+        <w:t>«Создать подсеть» принимает сетевой префикс CIDR, например 192.0.2.0/24, и имя сайта. «Переназначить подсеть» меняет её сайт. Для удаления сайта сначала перенесите его DC, переназначьте или удалите подсети и исключите сайт из Site Links. Занятый сайт удалить нельзя.</w:t>
+      </w:r>
+    </w:p>
+    <w:p>
+      <w:r>
+        <w:t>Изменения доступны роли admin. Readonly и helpdesk могут просматривать данные. При конфликте версии закройте форму, заново откройте список и повторите действие после сверки актуальных настроек.</w:t>
+      </w:r>
+    </w:p>
+    <w:p>
+      <w:r>
+        <w:br w:type="page"/>
+      </w:r>
+    </w:p>
+    <w:p>
+      <w:pPr>
+        <w:pStyle w:val="Heading1"/>
+      </w:pPr>
+      <w:r>
+        <w:t>Связи сайтов</w:t>
+      </w:r>
+    </w:p>
+    <w:p>
+      <w:r>
+        <w:t>В «Сайты → Связи сайтов» доступны IP Site Links. «Создать связь сайтов» принимает имя, список сайтов через точку с запятой, стоимость и интервал. Для новой связи нужны минимум два разных сайта.</w:t>
+      </w:r>
+    </w:p>
+    <w:p>
+      <w:r>
+        <w:drawing>
+          <wp:inline xmlns:a="http://schemas.openxmlformats.org/drawingml/2006/main" xmlns:pic="http://schemas.openxmlformats.org/drawingml/2006/picture">
+            <wp:extent cx="5760720" cy="4000500"/>
+            <wp:docPr id="12" name="Picture 12"/>
+            <wp:cNvGraphicFramePr>
+              <a:graphicFrameLocks noChangeAspect="1"/>
+            </wp:cNvGraphicFramePr>
+            <a:graphic>
+              <a:graphicData uri="http://schemas.openxmlformats.org/drawingml/2006/picture">
+                <pic:pic>
+                  <pic:nvPicPr>
+                    <pic:cNvPr id="0" name="v0110-site-links.png"/>
+                    <pic:cNvPicPr/>
+                  </pic:nvPicPr>
+                  <pic:blipFill>
+                    <a:blip r:embed="rId21"/>
+                    <a:stretch>
+                      <a:fillRect/>
+                    </a:stretch>
+                  </pic:blipFill>
+                  <pic:spPr>
+                    <a:xfrm>
+                      <a:off x="0" y="0"/>
+                      <a:ext cx="5760720" cy="4000500"/>
+                    </a:xfrm>
+                    <a:prstGeom prst="rect"/>
+                  </pic:spPr>
+                </pic:pic>
+              </a:graphicData>
+            </a:graphic>
+          </wp:inline>
+        </w:drawing>
+      </w:r>
+    </w:p>
+    <w:p>
+      <w:pPr>
+        <w:pStyle w:val="Caption"/>
+      </w:pPr>
+      <w:r>
+        <w:t>Рисунок 12. Связи сайтов со стоимостью, интервалом и действиями.</w:t>
+      </w:r>
+    </w:p>
+    <w:p>
+      <w:r>
+        <w:t>«Настроить связь» позволяет изменить сайты, стоимость 1–32767 и интервал 15–10080 минут с шагом 15. Для удаления выберите связь и подтвердите действие. Открытая форма использует версию объекта, чтобы обнаружить изменения другого администратора.</w:t>
+      </w:r>
+    </w:p>
+    <w:p>
+      <w:pPr>
+        <w:pStyle w:val="Heading2"/>
+      </w:pPr>
+      <w:r>
+        <w:t>Ограничение расписания Site Link</w:t>
+      </w:r>
+    </w:p>
+    <w:p>
+      <w:r>
+        <w:t>В проверенной Samba 4.17 найден сбой KCC при чтении расписания Site Link: вместо schedule код читает значение siteList. Запись этого параметра в sambaadm заблокирована до проверки исправления у поставщика; существующий параметр доступен для чтения. Для расписаний отдельных соединений используйте раздел «Репликация».</w:t>
+      </w:r>
+    </w:p>
+    <w:p>
+      <w:r>
+        <w:t>Основание: исходник Samba kcc_utils.py, класс SiteLink, load_sitelink. https://github.com/samba-team/samba/blob/samba-4.17.12/python/samba/kcc/kcc_utils.py</w:t>
+      </w:r>
+    </w:p>
+    <w:p>
+      <w:r>
+        <w:br w:type="page"/>
+      </w:r>
+    </w:p>
+    <w:p>
+      <w:pPr>
+        <w:pStyle w:val="Heading1"/>
+      </w:pPr>
+      <w:r>
+        <w:t>Состояние и управление репликацией</w:t>
+      </w:r>
+    </w:p>
+    <w:p>
+      <w:r>
+        <w:t>В «Репликация → Состояние репликации» укажите DNS контроллера или оставьте поле пустым для текущего. Список зарегистрированных DC не доказывает исправность. При отсутствии партнёров интерфейс сообщает, что состояние не подтверждено.</w:t>
+      </w:r>
+    </w:p>
+    <w:p>
+      <w:r>
+        <w:drawing>
+          <wp:inline xmlns:a="http://schemas.openxmlformats.org/drawingml/2006/main" xmlns:pic="http://schemas.openxmlformats.org/drawingml/2006/picture">
+            <wp:extent cx="5760720" cy="4000500"/>
+            <wp:docPr id="13" name="Picture 13"/>
+            <wp:cNvGraphicFramePr>
+              <a:graphicFrameLocks noChangeAspect="1"/>
+            </wp:cNvGraphicFramePr>
+            <a:graphic>
+              <a:graphicData uri="http://schemas.openxmlformats.org/drawingml/2006/picture">
+                <pic:pic>
+                  <pic:nvPicPr>
+                    <pic:cNvPr id="0" name="v0110-replication-status.png"/>
+                    <pic:cNvPicPr/>
+                  </pic:nvPicPr>
+                  <pic:blipFill>
+                    <a:blip r:embed="rId22"/>
+                    <a:stretch>
+                      <a:fillRect/>
+                    </a:stretch>
+                  </pic:blipFill>
+                  <pic:spPr>
+                    <a:xfrm>
+                      <a:off x="0" y="0"/>
+                      <a:ext cx="5760720" cy="4000500"/>
+                    </a:xfrm>
+                    <a:prstGeom prst="rect"/>
+                  </pic:spPr>
+                </pic:pic>
+              </a:graphicData>
+            </a:graphic>
+          </wp:inline>
+        </w:drawing>
+      </w:r>
+    </w:p>
+    <w:p>
+      <w:pPr>
+        <w:pStyle w:val="Caption"/>
+      </w:pPr>
+      <w:r>
+        <w:t>Рисунок 13. Результаты showrepl по партнёрам и разделам каталога.</w:t>
+      </w:r>
+    </w:p>
+    <w:p>
+      <w:r>
+        <w:t>Таблица показывает направление, партнёра, раздел, последовательные ошибки, последний успех и результат попытки. Ошибку подключения или samba-tool устраните до повторной операции. «Синхронизировать» передаёт выбранный раздел от источника к назначению; пустой раздел означает раздел домена.</w:t>
+      </w:r>
+    </w:p>
+    <w:p>
+      <w:pPr>
+        <w:pStyle w:val="Heading2"/>
+      </w:pPr>
+      <w:r>
+        <w:t>Соединения и KCC</w:t>
+      </w:r>
+    </w:p>
+    <w:p>
+      <w:r>
+        <w:t>В «Соединения репликации» можно создать ручное направление источник → назначение, включить или отключить его, задать расписание и удалить. KCC управляет автоматическими соединениями и может восстановить их. «Пересчитать топологию KCC» запускается для указанного DC после распространения изменений Configuration.</w:t>
+      </w:r>
+    </w:p>
+    <w:p>
+      <w:r>
+        <w:t>Расписание соединения содержит семь дней, начиная с воскресенья, в UTC. Пример: 08:15-12:00,13:00-18:45. Пустой день закрыт, 00:00-24:00 разрешает весь день. Шаг — 15 минут; переход через полночь разделите на два дня. Расписание сохраняется с признаком пользовательского, чтобы KCC не заменял его автоматически.</w:t>
+      </w:r>
+    </w:p>
+    <w:p>
+      <w:r>
+        <w:t>DRS не копирует файлы SYSVOL. Для GPO используйте отдельную доставку и проверку файлов. На стенде двух Samba DC проверены изменения топологии и передача пользователя. Применение GPO и работа сервиса непосредственно на ALT СП 10.2.2 ещё требуют приёмки.</w:t>
       </w:r>
     </w:p>
     <w:sectPr>

</xml_diff>

<commit_message>
docs: refresh illustrated administrator and user manuals
</commit_message>
<xml_diff>
--- a/docs/admin-guide/sambaadm-admin-guide.docx
+++ b/docs/admin-guide/sambaadm-admin-guide.docx
@@ -12,83 +12,12 @@
     </w:p>
     <w:p>
       <w:r>
-        <w:t>Установка и ежедневная работа с Samba Active Directory</w:t>
+        <w:t>Редакция от 21 октября 2026 года для текущей ветки main и сборки v0.23.0-dev. Последний опубликованный релиз v0.22.0 не включает новые область действия GPO, фильтрацию безопасности, мастер папок, профили Samba и графики нагрузки.</w:t>
       </w:r>
     </w:p>
     <w:p>
       <w:r>
-        <w:t>Для ALT SP Workstation 10.2.2 на x86-64. Редакция от 19 октября 2026 года. Версия приложения v0.8.0 с деревом каталога и административными формами.</w:t>
-      </w:r>
-    </w:p>
-    <w:p>
-      <w:r>
-        <w:t>Руководство помогает установить сервер, подключить его к домену, войти под доменной учётной записью и выполнять основные операции. Для работы нужен действующий домен Samba AD: приложение само домен не создаёт.</w:t>
-      </w:r>
-    </w:p>
-    <w:p>
-      <w:r>
-        <w:drawing>
-          <wp:inline xmlns:a="http://schemas.openxmlformats.org/drawingml/2006/main" xmlns:pic="http://schemas.openxmlformats.org/drawingml/2006/picture">
-            <wp:extent cx="6080760" cy="1563624"/>
-            <wp:docPr id="1" name="Picture 1"/>
-            <wp:cNvGraphicFramePr>
-              <a:graphicFrameLocks noChangeAspect="1"/>
-            </wp:cNvGraphicFramePr>
-            <a:graphic>
-              <a:graphicData uri="http://schemas.openxmlformats.org/drawingml/2006/picture">
-                <pic:pic>
-                  <pic:nvPicPr>
-                    <pic:cNvPr id="0" name="connection.png"/>
-                    <pic:cNvPicPr/>
-                  </pic:nvPicPr>
-                  <pic:blipFill>
-                    <a:blip r:embed="rId10"/>
-                    <a:stretch>
-                      <a:fillRect/>
-                    </a:stretch>
-                  </pic:blipFill>
-                  <pic:spPr>
-                    <a:xfrm>
-                      <a:off x="0" y="0"/>
-                      <a:ext cx="6080760" cy="1563624"/>
-                    </a:xfrm>
-                    <a:prstGeom prst="rect"/>
-                  </pic:spPr>
-                </pic:pic>
-              </a:graphicData>
-            </a:graphic>
-          </wp:inline>
-        </w:drawing>
-      </w:r>
-    </w:p>
-    <w:p>
-      <w:pPr>
-        <w:spacing w:after="160"/>
-      </w:pPr>
-      <w:r>
-        <w:rPr>
-          <w:i/>
-          <w:sz w:val="18"/>
-        </w:rPr>
-        <w:t>Рисунок 1. Схема подключения. Для сети используйте HTTPS и LDAPS.</w:t>
-      </w:r>
-    </w:p>
-    <w:p>
-      <w:pPr>
-        <w:pStyle w:val="Heading2"/>
-      </w:pPr>
-      <w:r>
-        <w:t>Что подготовить</w:t>
-      </w:r>
-    </w:p>
-    <w:p>
-      <w:r>
-        <w:t>Адрес и DNS-имя контроллера домена, Base DN каталога, доменную учётную запись, доверенный сертификат LDAPS и доступ к серверу установки. Для изменения объектов нужны соответствующие права в AD.</w:t>
-      </w:r>
-    </w:p>
-    <w:p>
-      <w:r>
-        <w:t>В примерах example.com, dc1.example.com и OU=People замените на значения своей организации. Имена пользователей и данные на иллюстрациях учебные.</w:t>
+        <w:t>Руководство предназначено для администратора существующего домена Samba AD. Приложение управляет доменом, но не создаёт его. Доменные операции используют LDAP, RPC и SMB без samba-tool. Общие папки, smb.conf, принтеры и системные метрики относятся к машине, где работает sambaadm.</w:t>
       </w:r>
     </w:p>
     <w:p>
@@ -101,566 +30,440 @@
     </w:p>
     <w:p>
       <w:r>
-        <w:t>2 — установка и первый запуск</w:t>
-        <w:br/>
-        <w:t>3 — подключение к домену</w:t>
-        <w:br/>
-        <w:t>4 — вход и права доступа</w:t>
-        <w:br/>
-        <w:t>5 — пользователи и группы</w:t>
-        <w:br/>
-        <w:t>6 — общие папки и ACL</w:t>
-        <w:br/>
-        <w:t>7 — остальные разделы и обслуживание</w:t>
-        <w:br/>
-        <w:t>8 — устранение ошибок</w:t>
-      </w:r>
-      <w:r>
-        <w:br/>
-        <w:t>9 — список и дерево пользователей</w:t>
-        <w:br/>
-        <w:t>10 — операции с пользователями</w:t>
-        <w:br/>
-        <w:t>11 — дерево и операции DNS</w:t>
-        <w:br/>
-        <w:t>12 — дерево и операции GPO</w:t>
+        <w:t>2  Установка и первый запуск</w:t>
       </w:r>
     </w:p>
     <w:p>
       <w:r>
-        <w:br w:type="page"/>
+        <w:t>3  Подключение и права</w:t>
+      </w:r>
+    </w:p>
+    <w:p>
+      <w:r>
+        <w:t>4  Вход и ежедневная проверка</w:t>
+      </w:r>
+    </w:p>
+    <w:p>
+      <w:r>
+        <w:t>5  Пользователи группы и подразделения</w:t>
+      </w:r>
+    </w:p>
+    <w:p>
+      <w:r>
+        <w:t>6  DNS и прочие доменные операции</w:t>
+      </w:r>
+    </w:p>
+    <w:p>
+      <w:r>
+        <w:t>7  Удалённый редактор политик ALT</w:t>
+      </w:r>
+    </w:p>
+    <w:p>
+      <w:r>
+        <w:t>8  Область действия и наследование GPO</w:t>
+      </w:r>
+    </w:p>
+    <w:p>
+      <w:r>
+        <w:t>9  Фильтрация и резервные копии GPO</w:t>
+      </w:r>
+    </w:p>
+    <w:p>
+      <w:r>
+        <w:t>10  Сайты и карта репликации</w:t>
+      </w:r>
+    </w:p>
+    <w:p>
+      <w:r>
+        <w:t>11  Общие папки и доменные группы</w:t>
+      </w:r>
+    </w:p>
+    <w:p>
+      <w:r>
+        <w:t>12  Профили Samba и показатели системы</w:t>
+      </w:r>
+    </w:p>
+    <w:p>
+      <w:r>
+        <w:t>13  Обслуживание и диагностика</w:t>
       </w:r>
     </w:p>
     <w:p>
       <w:pPr>
         <w:pStyle w:val="Heading1"/>
+        <w:pageBreakBefore/>
       </w:pPr>
       <w:r>
         <w:t>Установка и первый запуск</w:t>
       </w:r>
     </w:p>
     <w:p>
-      <w:pPr>
-        <w:pStyle w:val="Heading2"/>
-      </w:pPr>
       <w:r>
-        <w:t>Установка на ALT Linux</w:t>
+        <w:t>Скачайте бинарник и SHA256SUMS из GitHub Releases. Для ALT на x86-64 нужен linux-amd64, для Mac M4 — darwin-arm64. Исходники текущей версии можно собрать командой make build; новые функции main отсутствуют в старом бинарнике релиза.</w:t>
       </w:r>
-    </w:p>
-    <w:p>
       <w:r>
-        <w:t>1. Перенесите sambaadm-linux-amd64 и SHA256SUMS из каталога dist на целевой компьютер. Контрольную сумму сравнивайте с записью именно для Linux-файла.</w:t>
-      </w:r>
-    </w:p>
-    <w:p>
-      <w:r>
-        <w:t>2. Сделайте файл исполняемым, проверьте версию и установите его в системный каталог.</w:t>
+        <w:rPr>
+          <w:sz w:val="16"/>
+        </w:rPr>
+        <w:t xml:space="preserve"> https://github.com/rkislov/sambaadm/releases</w:t>
       </w:r>
     </w:p>
     <w:p>
       <w:pPr>
-        <w:spacing w:after="20" w:line="240" w:lineRule="auto"/>
+        <w:spacing w:after="0" w:line="240" w:lineRule="auto"/>
       </w:pPr>
       <w:r>
         <w:rPr>
           <w:rFonts w:ascii="Courier New" w:hAnsi="Courier New"/>
-          <w:sz w:val="17"/>
+          <w:sz w:val="16"/>
+        </w:rPr>
+        <w:t>sha256sum sambaadm-linux-amd64</w:t>
+      </w:r>
+    </w:p>
+    <w:p>
+      <w:pPr>
+        <w:spacing w:after="0" w:line="240" w:lineRule="auto"/>
+      </w:pPr>
+      <w:r>
+        <w:rPr>
+          <w:rFonts w:ascii="Courier New" w:hAnsi="Courier New"/>
+          <w:sz w:val="16"/>
         </w:rPr>
         <w:t>chmod +x sambaadm-linux-amd64</w:t>
       </w:r>
     </w:p>
     <w:p>
       <w:pPr>
-        <w:spacing w:after="20" w:line="240" w:lineRule="auto"/>
+        <w:spacing w:after="0" w:line="240" w:lineRule="auto"/>
       </w:pPr>
       <w:r>
         <w:rPr>
           <w:rFonts w:ascii="Courier New" w:hAnsi="Courier New"/>
-          <w:sz w:val="17"/>
-        </w:rPr>
-        <w:t>sha256sum sambaadm-linux-amd64</w:t>
-      </w:r>
-    </w:p>
-    <w:p>
-      <w:pPr>
-        <w:spacing w:after="20" w:line="240" w:lineRule="auto"/>
-      </w:pPr>
-      <w:r>
-        <w:rPr>
-          <w:rFonts w:ascii="Courier New" w:hAnsi="Courier New"/>
-          <w:sz w:val="17"/>
+          <w:sz w:val="16"/>
         </w:rPr>
         <w:t>./sambaadm-linux-amd64 version</w:t>
       </w:r>
     </w:p>
     <w:p>
       <w:pPr>
-        <w:spacing w:after="20" w:line="240" w:lineRule="auto"/>
+        <w:spacing w:after="0" w:line="240" w:lineRule="auto"/>
       </w:pPr>
       <w:r>
         <w:rPr>
           <w:rFonts w:ascii="Courier New" w:hAnsi="Courier New"/>
-          <w:sz w:val="17"/>
+          <w:sz w:val="16"/>
         </w:rPr>
         <w:t>sudo install -m 755 sambaadm-linux-amd64 /usr/local/bin/sambaadm</w:t>
       </w:r>
     </w:p>
     <w:p>
       <w:pPr>
-        <w:spacing w:after="20" w:line="240" w:lineRule="auto"/>
+        <w:spacing w:after="0" w:line="240" w:lineRule="auto"/>
       </w:pPr>
       <w:r>
         <w:rPr>
           <w:rFonts w:ascii="Courier New" w:hAnsi="Courier New"/>
-          <w:sz w:val="17"/>
+          <w:sz w:val="16"/>
         </w:rPr>
         <w:t>sudo mkdir -p /etc/sambaadm /var/log/sambaadm</w:t>
       </w:r>
     </w:p>
     <w:p>
       <w:pPr>
-        <w:spacing w:after="20" w:line="240" w:lineRule="auto"/>
+        <w:spacing w:after="0" w:line="240" w:lineRule="auto"/>
       </w:pPr>
       <w:r>
         <w:rPr>
           <w:rFonts w:ascii="Courier New" w:hAnsi="Courier New"/>
-          <w:sz w:val="17"/>
+          <w:sz w:val="16"/>
         </w:rPr>
         <w:t>sudo cp configs/config.example.yaml /etc/sambaadm/config.yaml</w:t>
       </w:r>
     </w:p>
     <w:p>
       <w:r>
-        <w:t>Последняя команда предполагает, что каталог configs из проекта тоже перенесён. Если у вас только бинарник, создайте config.yaml по примеру на следующей странице.</w:t>
+        <w:t>Сравните сумму с SHA256SUMS для того же файла. Последняя команда предполагает наличие исходников проекта. Linux-сборки выпускаются с CGO_ENABLED=0: обновлять glibc ради бинарника не требуется. Работа политик на клиенте ALT СП 10.2.2 требует отдельной приёмки.</w:t>
       </w:r>
     </w:p>
     <w:p>
       <w:r>
-        <w:t>Linux-сборка сделана с CGO_ENABLED=0 и GOAMD64=v1. Она не зависит от системной glibc. Для её запуска не требуется устанавливать Go или обновлять glibc.</w:t>
+        <w:t>После настройки подключения выполните проверку и запуск:</w:t>
       </w:r>
     </w:p>
     <w:p>
       <w:pPr>
-        <w:pStyle w:val="Heading2"/>
+        <w:spacing w:after="0" w:line="240" w:lineRule="auto"/>
       </w:pPr>
       <w:r>
-        <w:t>Проверка в терминале</w:t>
+        <w:rPr>
+          <w:rFonts w:ascii="Courier New" w:hAnsi="Courier New"/>
+          <w:sz w:val="16"/>
+        </w:rPr>
+        <w:t>sambaadm --config /etc/sambaadm/config.yaml serve --check</w:t>
       </w:r>
     </w:p>
     <w:p>
       <w:pPr>
-        <w:spacing w:after="20" w:line="240" w:lineRule="auto"/>
+        <w:spacing w:after="0" w:line="240" w:lineRule="auto"/>
       </w:pPr>
       <w:r>
         <w:rPr>
           <w:rFonts w:ascii="Courier New" w:hAnsi="Courier New"/>
-          <w:sz w:val="17"/>
+          <w:sz w:val="16"/>
         </w:rPr>
-        <w:t>sambaadm --config /etc/sambaadm/config.yaml serve --listen=127.0.0.1:8081</w:t>
+        <w:t>sambaadm --config /etc/sambaadm/config.yaml serve --listen=127.0.0.1:8081 --debug</w:t>
       </w:r>
     </w:p>
     <w:p>
       <w:r>
-        <w:t>Терминал оставьте открытым. Сообщение sambaadm listening означает, что веб-сервер запущен. Остановка — Ctrl+C. Открытие страницы само по себе ещё не подтверждает подключение к домену.</w:t>
-      </w:r>
-    </w:p>
-    <w:p>
-      <w:pPr>
-        <w:pStyle w:val="Heading2"/>
-      </w:pPr>
-      <w:r>
-        <w:t>Как открыть страницу</w:t>
-      </w:r>
-    </w:p>
-    <w:p>
-      <w:r>
-        <w:t>На самом сервере: http://127.0.0.1:8081/login. На другом компьютере используйте IP-адрес или DNS-имя сервера. localhost и 127.0.0.1 всегда обозначают компьютер, на котором открыт браузер.</w:t>
-      </w:r>
-    </w:p>
-    <w:p>
-      <w:r>
-        <w:t>Для удалённого доступа настройте HTTPS и доступ через межсетевой экран. Прослушивание только 127.0.0.1 подходит для локальной проверки. Флаг --listen=:8081 открывает порт на всех интерфейсах.</w:t>
-      </w:r>
-    </w:p>
-    <w:p>
-      <w:pPr>
-        <w:pStyle w:val="Heading2"/>
-      </w:pPr>
-      <w:r>
-        <w:t>Проверка на Mac</w:t>
-      </w:r>
-    </w:p>
-    <w:p>
-      <w:r>
-        <w:t>На Mac используйте bin/sambaadm, собранный командой make build, либо darwin-arm64 для Apple Silicon / darwin-amd64 для Intel. Файл linux-amd64 предназначен для Linux. Подключение к AD на Mac возможно через LDAPS; локальные Linux-операции выполняйте на Linux-сервере.</w:t>
-      </w:r>
-    </w:p>
-    <w:p>
-      <w:r>
-        <w:br w:type="page"/>
+        <w:t>Откройте http://127.0.0.1:8081/login на той же машине. Для сетевого доступа настройте HTTPS и адрес прослушивания. localhost в браузере всегда означает компьютер с браузером. Успешный --check подтверждает служебный LDAP Bind и чтение Base DN, но не проверяет все операции RPC, SMB и файловые права.</w:t>
       </w:r>
     </w:p>
     <w:p>
       <w:pPr>
         <w:pStyle w:val="Heading1"/>
+        <w:pageBreakBefore/>
       </w:pPr>
       <w:r>
-        <w:t>Подключение к домену</w:t>
+        <w:t>Подключение и права</w:t>
       </w:r>
     </w:p>
     <w:p>
       <w:r>
-        <w:t>Измените /etc/sambaadm/config.yaml. Минимальный пример для удалённого контроллера домена:</w:t>
+        <w:t>Используйте полный пример конфигурации. Замените домен, DN групп и пути на реальные значения. Минимальные параметры:</w:t>
+      </w:r>
+      <w:r>
+        <w:rPr>
+          <w:sz w:val="16"/>
+        </w:rPr>
+        <w:t xml:space="preserve"> https://github.com/rkislov/sambaadm/blob/main/configs/config.example.yaml</w:t>
       </w:r>
     </w:p>
     <w:p>
       <w:pPr>
-        <w:spacing w:after="20" w:line="240" w:lineRule="auto"/>
+        <w:spacing w:after="0" w:line="240" w:lineRule="auto"/>
       </w:pPr>
       <w:r>
         <w:rPr>
           <w:rFonts w:ascii="Courier New" w:hAnsi="Courier New"/>
-          <w:sz w:val="17"/>
+          <w:sz w:val="16"/>
         </w:rPr>
         <w:t>server:</w:t>
       </w:r>
     </w:p>
     <w:p>
       <w:pPr>
-        <w:spacing w:after="20" w:line="240" w:lineRule="auto"/>
+        <w:spacing w:after="0" w:line="240" w:lineRule="auto"/>
       </w:pPr>
       <w:r>
         <w:rPr>
           <w:rFonts w:ascii="Courier New" w:hAnsi="Courier New"/>
-          <w:sz w:val="17"/>
+          <w:sz w:val="16"/>
         </w:rPr>
         <w:t xml:space="preserve">  listen: "127.0.0.1:8081"</w:t>
       </w:r>
     </w:p>
     <w:p>
       <w:pPr>
-        <w:spacing w:after="20" w:line="240" w:lineRule="auto"/>
+        <w:spacing w:after="0" w:line="240" w:lineRule="auto"/>
       </w:pPr>
       <w:r>
         <w:rPr>
           <w:rFonts w:ascii="Courier New" w:hAnsi="Courier New"/>
-          <w:sz w:val="17"/>
+          <w:sz w:val="16"/>
         </w:rPr>
         <w:t>ldap:</w:t>
       </w:r>
     </w:p>
     <w:p>
       <w:pPr>
-        <w:spacing w:after="20" w:line="240" w:lineRule="auto"/>
+        <w:spacing w:after="0" w:line="240" w:lineRule="auto"/>
       </w:pPr>
       <w:r>
         <w:rPr>
           <w:rFonts w:ascii="Courier New" w:hAnsi="Courier New"/>
-          <w:sz w:val="17"/>
+          <w:sz w:val="16"/>
         </w:rPr>
         <w:t xml:space="preserve">  uri: "ldaps://dc1.example.com:636"</w:t>
       </w:r>
     </w:p>
     <w:p>
       <w:pPr>
-        <w:spacing w:after="20" w:line="240" w:lineRule="auto"/>
+        <w:spacing w:after="0" w:line="240" w:lineRule="auto"/>
       </w:pPr>
       <w:r>
         <w:rPr>
           <w:rFonts w:ascii="Courier New" w:hAnsi="Courier New"/>
-          <w:sz w:val="17"/>
+          <w:sz w:val="16"/>
+        </w:rPr>
+        <w:t xml:space="preserve">  ca_cert: /etc/sambaadm/domain-ca.pem</w:t>
+      </w:r>
+    </w:p>
+    <w:p>
+      <w:pPr>
+        <w:spacing w:after="0" w:line="240" w:lineRule="auto"/>
+      </w:pPr>
+      <w:r>
+        <w:rPr>
+          <w:rFonts w:ascii="Courier New" w:hAnsi="Courier New"/>
+          <w:sz w:val="16"/>
         </w:rPr>
         <w:t xml:space="preserve">  base_dn: "DC=example,DC=com"</w:t>
       </w:r>
     </w:p>
     <w:p>
       <w:pPr>
-        <w:spacing w:after="20" w:line="240" w:lineRule="auto"/>
+        <w:spacing w:after="0" w:line="240" w:lineRule="auto"/>
       </w:pPr>
       <w:r>
         <w:rPr>
           <w:rFonts w:ascii="Courier New" w:hAnsi="Courier New"/>
-          <w:sz w:val="17"/>
+          <w:sz w:val="16"/>
         </w:rPr>
         <w:t xml:space="preserve">  bind:</w:t>
       </w:r>
     </w:p>
     <w:p>
       <w:pPr>
-        <w:spacing w:after="20" w:line="240" w:lineRule="auto"/>
+        <w:spacing w:after="0" w:line="240" w:lineRule="auto"/>
       </w:pPr>
       <w:r>
         <w:rPr>
           <w:rFonts w:ascii="Courier New" w:hAnsi="Courier New"/>
-          <w:sz w:val="17"/>
+          <w:sz w:val="16"/>
         </w:rPr>
         <w:t xml:space="preserve">    type: simple</w:t>
       </w:r>
     </w:p>
     <w:p>
       <w:pPr>
-        <w:spacing w:after="20" w:line="240" w:lineRule="auto"/>
+        <w:spacing w:after="0" w:line="240" w:lineRule="auto"/>
       </w:pPr>
       <w:r>
         <w:rPr>
           <w:rFonts w:ascii="Courier New" w:hAnsi="Courier New"/>
-          <w:sz w:val="17"/>
+          <w:sz w:val="16"/>
         </w:rPr>
         <w:t xml:space="preserve">    user: "svc-sambaadm@example.com"</w:t>
       </w:r>
     </w:p>
     <w:p>
       <w:pPr>
-        <w:spacing w:after="20" w:line="240" w:lineRule="auto"/>
+        <w:spacing w:after="0" w:line="240" w:lineRule="auto"/>
       </w:pPr>
       <w:r>
         <w:rPr>
           <w:rFonts w:ascii="Courier New" w:hAnsi="Courier New"/>
-          <w:sz w:val="17"/>
+          <w:sz w:val="16"/>
         </w:rPr>
         <w:t xml:space="preserve">    password_env: SAMBAADM_PASSWORD</w:t>
       </w:r>
     </w:p>
     <w:p>
       <w:pPr>
-        <w:spacing w:after="20" w:line="240" w:lineRule="auto"/>
+        <w:spacing w:after="0" w:line="240" w:lineRule="auto"/>
       </w:pPr>
       <w:r>
         <w:rPr>
           <w:rFonts w:ascii="Courier New" w:hAnsi="Courier New"/>
-          <w:sz w:val="17"/>
+          <w:sz w:val="16"/>
         </w:rPr>
         <w:t>auth:</w:t>
       </w:r>
     </w:p>
     <w:p>
       <w:pPr>
-        <w:spacing w:after="20" w:line="240" w:lineRule="auto"/>
+        <w:spacing w:after="0" w:line="240" w:lineRule="auto"/>
       </w:pPr>
       <w:r>
         <w:rPr>
           <w:rFonts w:ascii="Courier New" w:hAnsi="Courier New"/>
-          <w:sz w:val="17"/>
-        </w:rPr>
-        <w:t xml:space="preserve">  session_ttl: 8h</w:t>
-      </w:r>
-    </w:p>
-    <w:p>
-      <w:pPr>
-        <w:spacing w:after="20" w:line="240" w:lineRule="auto"/>
-      </w:pPr>
-      <w:r>
-        <w:rPr>
-          <w:rFonts w:ascii="Courier New" w:hAnsi="Courier New"/>
-          <w:sz w:val="17"/>
+          <w:sz w:val="16"/>
         </w:rPr>
         <w:t xml:space="preserve">  roles:</w:t>
       </w:r>
     </w:p>
     <w:p>
       <w:pPr>
-        <w:spacing w:after="20" w:line="240" w:lineRule="auto"/>
+        <w:spacing w:after="0" w:line="240" w:lineRule="auto"/>
       </w:pPr>
       <w:r>
         <w:rPr>
           <w:rFonts w:ascii="Courier New" w:hAnsi="Courier New"/>
-          <w:sz w:val="17"/>
+          <w:sz w:val="16"/>
         </w:rPr>
         <w:t xml:space="preserve">    admins:</w:t>
       </w:r>
     </w:p>
     <w:p>
       <w:pPr>
-        <w:spacing w:after="20" w:line="240" w:lineRule="auto"/>
+        <w:spacing w:after="0" w:line="240" w:lineRule="auto"/>
       </w:pPr>
       <w:r>
         <w:rPr>
           <w:rFonts w:ascii="Courier New" w:hAnsi="Courier New"/>
-          <w:sz w:val="17"/>
+          <w:sz w:val="16"/>
         </w:rPr>
         <w:t xml:space="preserve">      - "CN=Domain Admins,CN=Users,DC=example,DC=com"</w:t>
       </w:r>
     </w:p>
     <w:p>
       <w:pPr>
-        <w:spacing w:after="20" w:line="240" w:lineRule="auto"/>
+        <w:spacing w:after="0" w:line="240" w:lineRule="auto"/>
       </w:pPr>
       <w:r>
         <w:rPr>
           <w:rFonts w:ascii="Courier New" w:hAnsi="Courier New"/>
-          <w:sz w:val="17"/>
+          <w:sz w:val="16"/>
         </w:rPr>
         <w:t xml:space="preserve">    helpdesk:</w:t>
       </w:r>
     </w:p>
     <w:p>
       <w:pPr>
-        <w:spacing w:after="20" w:line="240" w:lineRule="auto"/>
+        <w:spacing w:after="0" w:line="240" w:lineRule="auto"/>
       </w:pPr>
       <w:r>
         <w:rPr>
           <w:rFonts w:ascii="Courier New" w:hAnsi="Courier New"/>
-          <w:sz w:val="17"/>
+          <w:sz w:val="16"/>
         </w:rPr>
         <w:t xml:space="preserve">      - "CN=Helpdesk,OU=Groups,DC=example,DC=com"</w:t>
       </w:r>
     </w:p>
     <w:p>
-      <w:pPr>
-        <w:spacing w:after="20" w:line="240" w:lineRule="auto"/>
-      </w:pPr>
       <w:r>
-        <w:rPr>
-          <w:rFonts w:ascii="Courier New" w:hAnsi="Courier New"/>
-          <w:sz w:val="17"/>
-        </w:rPr>
-        <w:t>audit:</w:t>
-      </w:r>
-    </w:p>
-    <w:p>
-      <w:pPr>
-        <w:spacing w:after="20" w:line="240" w:lineRule="auto"/>
-      </w:pPr>
-      <w:r>
-        <w:rPr>
-          <w:rFonts w:ascii="Courier New" w:hAnsi="Courier New"/>
-          <w:sz w:val="17"/>
-        </w:rPr>
-        <w:t xml:space="preserve">  file: /var/log/sambaadm/audit.log</w:t>
-      </w:r>
-    </w:p>
-    <w:p>
-      <w:pPr>
-        <w:spacing w:after="20" w:line="240" w:lineRule="auto"/>
-      </w:pPr>
-      <w:r>
-        <w:rPr>
-          <w:rFonts w:ascii="Courier New" w:hAnsi="Courier New"/>
-          <w:sz w:val="17"/>
-        </w:rPr>
-        <w:t>logging:</w:t>
-      </w:r>
-    </w:p>
-    <w:p>
-      <w:pPr>
-        <w:spacing w:after="20" w:line="240" w:lineRule="auto"/>
-      </w:pPr>
-      <w:r>
-        <w:rPr>
-          <w:rFonts w:ascii="Courier New" w:hAnsi="Courier New"/>
-          <w:sz w:val="17"/>
-        </w:rPr>
-        <w:t xml:space="preserve">  level: info</w:t>
+        <w:t>Служебная запись выполняет операции приложения; пароль входящего пользователя проверяется отдельным соединением. Задайте SAMBAADM_PASSWORD в окружении процесса. Для Bash можно использовать read -r -s -p 'Пароль: ' SAMBAADM_PASSWORD, затем export SAMBAADM_PASSWORD. В YAML пароль не записывайте.</w:t>
       </w:r>
     </w:p>
     <w:p>
       <w:r>
-        <w:t>ldap.uri — адрес контроллера. base_dn — корень вашего каталога. bind.user — существующая служебная учётная запись с делегированными правами для нужных операций. auth.roles содержит точные DN реально существующих групп.</w:t>
-      </w:r>
-    </w:p>
-    <w:p>
-      <w:pPr>
-        <w:pStyle w:val="Heading2"/>
-      </w:pPr>
-      <w:r>
-        <w:t>Пароль служебной записи</w:t>
+        <w:t>Настройте доверие к CA и соответствие имени DC сертификату. Для браузера используйте server.tls.cert/key либо HTTPS на обратном прокси. YAML перечитывается после перезапуска; веб-настройки не заменяют настройку LDAP.</w:t>
       </w:r>
     </w:p>
     <w:p>
       <w:r>
-        <w:t>Пароль хранится в переменной окружения, а не в YAML. Для интерактивного запуска в Bash:</w:t>
-      </w:r>
-    </w:p>
-    <w:p>
-      <w:pPr>
-        <w:spacing w:after="20" w:line="240" w:lineRule="auto"/>
-      </w:pPr>
-      <w:r>
-        <w:rPr>
-          <w:rFonts w:ascii="Courier New" w:hAnsi="Courier New"/>
-          <w:sz w:val="17"/>
-        </w:rPr>
-        <w:t>read -r -s -p "Пароль служебной записи: " SAMBAADM_PASSWORD</w:t>
-      </w:r>
-    </w:p>
-    <w:p>
-      <w:pPr>
-        <w:spacing w:after="20" w:line="240" w:lineRule="auto"/>
-      </w:pPr>
-      <w:r>
-        <w:rPr>
-          <w:rFonts w:ascii="Courier New" w:hAnsi="Courier New"/>
-          <w:sz w:val="17"/>
-        </w:rPr>
-        <w:t>echo</w:t>
-      </w:r>
-    </w:p>
-    <w:p>
-      <w:pPr>
-        <w:spacing w:after="20" w:line="240" w:lineRule="auto"/>
-      </w:pPr>
-      <w:r>
-        <w:rPr>
-          <w:rFonts w:ascii="Courier New" w:hAnsi="Courier New"/>
-          <w:sz w:val="17"/>
-        </w:rPr>
-        <w:t>export SAMBAADM_PASSWORD</w:t>
-      </w:r>
-    </w:p>
-    <w:p>
-      <w:pPr>
-        <w:spacing w:after="20" w:line="240" w:lineRule="auto"/>
-      </w:pPr>
-      <w:r>
-        <w:rPr>
-          <w:rFonts w:ascii="Courier New" w:hAnsi="Courier New"/>
-          <w:sz w:val="17"/>
-        </w:rPr>
-        <w:t>sambaadm --config /etc/sambaadm/config.yaml serve --listen=127.0.0.1:8081</w:t>
-      </w:r>
-    </w:p>
-    <w:p>
-      <w:r>
-        <w:t>Процесс должен иметь право записи в файл аудита. Для постоянного сервиса задайте SAMBAADM_PASSWORD в /etc/sambaadm/env и ограничьте доступ к файлу правами 0600.</w:t>
-      </w:r>
-    </w:p>
-    <w:p>
-      <w:pPr>
-        <w:pStyle w:val="Heading2"/>
-      </w:pPr>
-      <w:r>
-        <w:t>Шифрование и сертификаты</w:t>
-      </w:r>
-    </w:p>
-    <w:p>
-      <w:r>
-        <w:t>Для LDAPS имя контроллера должно совпадать с сертификатом, а его центр сертификации должен быть доверен ОС сервера приложения. В рабочей сети не используйте простой ldap:// для передачи паролей. Для веб-интерфейса задайте server.tls.cert и server.tls.key либо настройте HTTPS на обратном прокси.</w:t>
-      </w:r>
-    </w:p>
-    <w:p>
-      <w:r>
-        <w:t>После изменения YAML перезапустите процесс. Раздел «Настройки» в браузере меняет язык, а не параметры подключения к LDAP.</w:t>
-      </w:r>
-    </w:p>
-    <w:p>
-      <w:r>
-        <w:br w:type="page"/>
+        <w:t>Роли сопоставляются с memberOf при входе: admin выполняет изменения, helpdesk включает и отключает пользователей и сбрасывает пароли, readonly читает данные. Если группы ролей не заданы, все вошедшие получают admin. В рабочем домене задайте группы явно; после изменения членства войдите заново. Роль приложения не заменяет права служебной записи в AD и права процесса в ОС.</w:t>
       </w:r>
     </w:p>
     <w:p>
       <w:pPr>
         <w:pStyle w:val="Heading1"/>
+        <w:pageBreakBefore/>
       </w:pPr>
       <w:r>
-        <w:t>Вход и права доступа</w:t>
+        <w:t>Вход и ежедневная проверка</w:t>
       </w:r>
     </w:p>
     <w:p>
+      <w:pPr>
+        <w:keepNext/>
+      </w:pPr>
       <w:r>
         <w:drawing>
           <wp:inline xmlns:a="http://schemas.openxmlformats.org/drawingml/2006/main" xmlns:pic="http://schemas.openxmlformats.org/drawingml/2006/picture">
-            <wp:extent cx="5852160" cy="3830505"/>
-            <wp:docPr id="2" name="Picture 2"/>
+            <wp:extent cx="6120000" cy="4005818"/>
+            <wp:docPr id="1" name="Picture 1"/>
             <wp:cNvGraphicFramePr>
               <a:graphicFrameLocks noChangeAspect="1"/>
             </wp:cNvGraphicFramePr>
@@ -672,7 +475,7 @@
                     <pic:cNvPicPr/>
                   </pic:nvPicPr>
                   <pic:blipFill>
-                    <a:blip r:embed="rId11"/>
+                    <a:blip r:embed="rId10"/>
                     <a:stretch>
                       <a:fillRect/>
                     </a:stretch>
@@ -680,1570 +483,7 @@
                   <pic:spPr>
                     <a:xfrm>
                       <a:off x="0" y="0"/>
-                      <a:ext cx="5852160" cy="3830505"/>
-                    </a:xfrm>
-                    <a:prstGeom prst="rect"/>
-                  </pic:spPr>
-                </pic:pic>
-              </a:graphicData>
-            </a:graphic>
-          </wp:inline>
-        </w:drawing>
-      </w:r>
-    </w:p>
-    <w:p>
-      <w:pPr>
-        <w:spacing w:after="160"/>
-      </w:pPr>
-      <w:r>
-        <w:rPr>
-          <w:i/>
-          <w:sz w:val="18"/>
-        </w:rPr>
-        <w:t>Рисунок 2. Реальная страница входа локально запущенного приложения.</w:t>
-      </w:r>
-    </w:p>
-    <w:p>
-      <w:r>
-        <w:t>1. Откройте /login на нужном сервере.</w:t>
-      </w:r>
-    </w:p>
-    <w:p>
-      <w:r>
-        <w:t>2. В поле пользователя введите доменный UPN, например ivanov@example.com.</w:t>
-      </w:r>
-    </w:p>
-    <w:p>
-      <w:r>
-        <w:t>3. Введите пароль этой доменной учётной записи и нажмите кнопку входа.</w:t>
-      </w:r>
-    </w:p>
-    <w:p>
-      <w:r>
-        <w:t>4. Убедитесь, что открылась главная страница и отображается ожидаемая роль.</w:t>
-      </w:r>
-    </w:p>
-    <w:p>
-      <w:r>
-        <w:t>Стандартной пары admin/admin нет. Локальный пароль Mac или Linux не подходит, если он не является паролем соответствующей записи в домене. Создание пользователя в приложении означает создание объекта AD.</w:t>
-      </w:r>
-    </w:p>
-    <w:p>
-      <w:pPr>
-        <w:pStyle w:val="Heading2"/>
-      </w:pPr>
-      <w:r>
-        <w:t>Назначение ролей</w:t>
-      </w:r>
-    </w:p>
-    <w:p>
-      <w:r>
-        <w:t>admin — административные изменения; helpdesk — операции поддержки, включая включение и отключение пользователя и сброс пароля; readonly — просмотр. Доступность конкретного действия зависит также от прав используемой учётной записи в AD и от прав процесса в ОС.</w:t>
-      </w:r>
-    </w:p>
-    <w:p>
-      <w:r>
-        <w:t>Приложение сопоставляет memberOf пользователя с DN групп из auth.roles при входе. Если группы ролей не заданы, все успешно вошедшие получают admin. Поэтому задайте группы явно перед использованием в рабочем домене. После изменения членства выйдите и войдите заново.</w:t>
-      </w:r>
-    </w:p>
-    <w:p>
-      <w:pPr>
-        <w:pStyle w:val="Heading2"/>
-      </w:pPr>
-      <w:r>
-        <w:t>Завершение работы</w:t>
-      </w:r>
-    </w:p>
-    <w:p>
-      <w:r>
-        <w:t>Нажмите «Выйти» в верхней панели. Не оставляйте административную сессию открытой на общем компьютере. При ошибке входа смотрите страницу 8.</w:t>
-      </w:r>
-    </w:p>
-    <w:p>
-      <w:r>
-        <w:br w:type="page"/>
-      </w:r>
-    </w:p>
-    <w:p>
-      <w:pPr>
-        <w:pStyle w:val="Heading1"/>
-      </w:pPr>
-      <w:r>
-        <w:t>Пользователи и группы</w:t>
-      </w:r>
-    </w:p>
-    <w:p>
-      <w:r>
-        <w:drawing>
-          <wp:inline xmlns:a="http://schemas.openxmlformats.org/drawingml/2006/main" xmlns:pic="http://schemas.openxmlformats.org/drawingml/2006/picture">
-            <wp:extent cx="5577840" cy="3650950"/>
-            <wp:docPr id="3" name="Picture 3"/>
-            <wp:cNvGraphicFramePr>
-              <a:graphicFrameLocks noChangeAspect="1"/>
-            </wp:cNvGraphicFramePr>
-            <a:graphic>
-              <a:graphicData uri="http://schemas.openxmlformats.org/drawingml/2006/picture">
-                <pic:pic>
-                  <pic:nvPicPr>
-                    <pic:cNvPr id="0" name="users.png"/>
-                    <pic:cNvPicPr/>
-                  </pic:nvPicPr>
-                  <pic:blipFill>
-                    <a:blip r:embed="rId12"/>
-                    <a:stretch>
-                      <a:fillRect/>
-                    </a:stretch>
-                  </pic:blipFill>
-                  <pic:spPr>
-                    <a:xfrm>
-                      <a:off x="0" y="0"/>
-                      <a:ext cx="5577840" cy="3650950"/>
-                    </a:xfrm>
-                    <a:prstGeom prst="rect"/>
-                  </pic:spPr>
-                </pic:pic>
-              </a:graphicData>
-            </a:graphic>
-          </wp:inline>
-        </w:drawing>
-      </w:r>
-    </w:p>
-    <w:p>
-      <w:pPr>
-        <w:spacing w:after="160"/>
-      </w:pPr>
-      <w:r>
-        <w:rPr>
-          <w:i/>
-          <w:sz w:val="18"/>
-        </w:rPr>
-        <w:t>Рисунок 3. Форма создания пользователя из шаблона приложения. Данные учебные.</w:t>
-      </w:r>
-    </w:p>
-    <w:p>
-      <w:pPr>
-        <w:pStyle w:val="Heading2"/>
-      </w:pPr>
-      <w:r>
-        <w:t>Создание пользователя</w:t>
-      </w:r>
-    </w:p>
-    <w:p>
-      <w:r>
-        <w:t>1. Откройте «Пользователи» и нажмите «Создать пользователя» под ролью admin. Заполните форму в открывшемся окне. Альтернативная форма на иллюстрации также доступна по /users/new.</w:t>
-      </w:r>
-    </w:p>
-    <w:p>
-      <w:r>
-        <w:t>2. Заполните Login без доменного суффикса, Display name и Password. В OU (DN) укажите существующий контейнер, например OU=People,DC=example,DC=com. При необходимости укажите Email.</w:t>
-      </w:r>
-    </w:p>
-    <w:p>
-      <w:r>
-        <w:t>3. Оставьте Enabled для активной записи и нажмите OK. Проверьте появление записи в списке и правильность DN. Пароль должен отвечать политике домена.</w:t>
-      </w:r>
-    </w:p>
-    <w:p>
-      <w:pPr>
-        <w:pStyle w:val="Heading2"/>
-      </w:pPr>
-      <w:r>
-        <w:t>Блокировка и смена пароля</w:t>
-      </w:r>
-    </w:p>
-    <w:p>
-      <w:r>
-        <w:t>В списке используйте «Отключить» или «Включить» напротив записи. «Сбросить пароль» открывает форму с повторным вводом. Сверяйте логин и DN перед действием. Для CLI новый пароль вводится интерактивно:</w:t>
-      </w:r>
-    </w:p>
-    <w:p>
-      <w:pPr>
-        <w:spacing w:after="20" w:line="240" w:lineRule="auto"/>
-      </w:pPr>
-      <w:r>
-        <w:rPr>
-          <w:rFonts w:ascii="Courier New" w:hAnsi="Courier New"/>
-          <w:sz w:val="17"/>
-        </w:rPr>
-        <w:t>sambaadm --config /etc/sambaadm/config.yaml user set-password ivanov</w:t>
-      </w:r>
-    </w:p>
-    <w:p>
-      <w:pPr>
-        <w:pStyle w:val="Heading2"/>
-      </w:pPr>
-      <w:r>
-        <w:t>Группы и членство</w:t>
-      </w:r>
-    </w:p>
-    <w:p>
-      <w:r>
-        <w:t>В разделе «Группы» доступны свойства, участники, создание и удаление группы. Кнопки «Добавить участника» и «Исключить участника» принимают DN записи. Те же операции доступны через CLI с настроенным конфигом и SAMBAADM_PASSWORD:</w:t>
-      </w:r>
-    </w:p>
-    <w:p>
-      <w:pPr>
-        <w:spacing w:after="20" w:line="240" w:lineRule="auto"/>
-      </w:pPr>
-      <w:r>
-        <w:rPr>
-          <w:rFonts w:ascii="Courier New" w:hAnsi="Courier New"/>
-          <w:sz w:val="17"/>
-        </w:rPr>
-        <w:t>sambaadm --config /etc/sambaadm/config.yaml group members Finance</w:t>
-      </w:r>
-    </w:p>
-    <w:p>
-      <w:pPr>
-        <w:spacing w:after="20" w:line="240" w:lineRule="auto"/>
-      </w:pPr>
-      <w:r>
-        <w:rPr>
-          <w:rFonts w:ascii="Courier New" w:hAnsi="Courier New"/>
-          <w:sz w:val="17"/>
-        </w:rPr>
-        <w:t>sambaadm --config /etc/sambaadm/config.yaml group add-member Finance \</w:t>
-      </w:r>
-    </w:p>
-    <w:p>
-      <w:pPr>
-        <w:spacing w:after="20" w:line="240" w:lineRule="auto"/>
-      </w:pPr>
-      <w:r>
-        <w:rPr>
-          <w:rFonts w:ascii="Courier New" w:hAnsi="Courier New"/>
-          <w:sz w:val="17"/>
-        </w:rPr>
-        <w:t xml:space="preserve">  "CN=Иван Иванов,OU=People,DC=example,DC=com"</w:t>
-      </w:r>
-    </w:p>
-    <w:p>
-      <w:r>
-        <w:t>DN участника берите из каталога: он может отличаться от примера и от логина. После изменения повторно проверьте список участников.</w:t>
-      </w:r>
-    </w:p>
-    <w:p>
-      <w:r>
-        <w:br w:type="page"/>
-      </w:r>
-    </w:p>
-    <w:p>
-      <w:pPr>
-        <w:pStyle w:val="Heading1"/>
-      </w:pPr>
-      <w:r>
-        <w:t>Общие папки и файловые права</w:t>
-      </w:r>
-    </w:p>
-    <w:p>
-      <w:r>
-        <w:drawing>
-          <wp:inline xmlns:a="http://schemas.openxmlformats.org/drawingml/2006/main" xmlns:pic="http://schemas.openxmlformats.org/drawingml/2006/picture">
-            <wp:extent cx="5577840" cy="3650950"/>
-            <wp:docPr id="4" name="Picture 4"/>
-            <wp:cNvGraphicFramePr>
-              <a:graphicFrameLocks noChangeAspect="1"/>
-            </wp:cNvGraphicFramePr>
-            <a:graphic>
-              <a:graphicData uri="http://schemas.openxmlformats.org/drawingml/2006/picture">
-                <pic:pic>
-                  <pic:nvPicPr>
-                    <pic:cNvPr id="0" name="shares.png"/>
-                    <pic:cNvPicPr/>
-                  </pic:nvPicPr>
-                  <pic:blipFill>
-                    <a:blip r:embed="rId13"/>
-                    <a:stretch>
-                      <a:fillRect/>
-                    </a:stretch>
-                  </pic:blipFill>
-                  <pic:spPr>
-                    <a:xfrm>
-                      <a:off x="0" y="0"/>
-                      <a:ext cx="5577840" cy="3650950"/>
-                    </a:xfrm>
-                    <a:prstGeom prst="rect"/>
-                  </pic:spPr>
-                </pic:pic>
-              </a:graphicData>
-            </a:graphic>
-          </wp:inline>
-        </w:drawing>
-      </w:r>
-    </w:p>
-    <w:p>
-      <w:pPr>
-        <w:spacing w:after="160"/>
-      </w:pPr>
-      <w:r>
-        <w:rPr>
-          <w:i/>
-          <w:sz w:val="18"/>
-        </w:rPr>
-        <w:t>Рисунок 4. Верхняя часть формы общей папки из шаблона приложения.</w:t>
-      </w:r>
-    </w:p>
-    <w:p>
-      <w:r>
-        <w:t>1. Настройте samba.smb_conf, samba.shares_root и samba.reload_cmd в YAML. Создавайте папки только на том сервере, где запущен sambaadm.</w:t>
-      </w:r>
-    </w:p>
-    <w:p>
-      <w:r>
-        <w:t>2. В разделе общих папок откройте создание, выберите подходящий шаблон доступа и задайте имя, например Finance, и путь /srv/samba/Finance.</w:t>
-      </w:r>
-    </w:p>
-    <w:p>
-      <w:r>
-        <w:t>3. Укажите разрешённых пользователей или группы, права записи и чтения. Для группы используется @, например @Finance. Проверьте флаги «Только чтение» и гостевого доступа.</w:t>
-      </w:r>
-    </w:p>
-    <w:p>
-      <w:r>
-        <w:t>4. В нижней части формы проверьте владельца, режим каталога, ACL и ACL по умолчанию. Примените форму, затем откройте ACL папки и проверьте результат.</w:t>
-      </w:r>
-    </w:p>
-    <w:p>
-      <w:pPr>
-        <w:pStyle w:val="Heading2"/>
-      </w:pPr>
-      <w:r>
-        <w:t>Два уровня доступа</w:t>
-      </w:r>
-    </w:p>
-    <w:p>
-      <w:r>
-        <w:t>Доступ должен разрешаться и настройками Samba, и файловыми правами ОС. Разрешение записи в smb.conf не отменяет запрет записи в POSIX ACL. ACL по умолчанию относится к наследованию прав новыми объектами.</w:t>
-      </w:r>
-    </w:p>
-    <w:p>
-      <w:r>
-        <w:t>Для изменения файлов нужны getfacl/setfacl и, для расширенных атрибутов, getfattr/setfattr. Имена доменных пользователей и групп должны разрешаться средствами ОС. Процессу нужны права на smb.conf и каталоги, а также возможность выполнить команду reload.</w:t>
-      </w:r>
-    </w:p>
-    <w:p>
-      <w:pPr>
-        <w:pStyle w:val="Heading2"/>
-      </w:pPr>
-      <w:r>
-        <w:t>Проверка результата</w:t>
-      </w:r>
-    </w:p>
-    <w:p>
-      <w:r>
-        <w:t>С клиентской машины откройте \\имя-сервера\Finance под обычной разрешённой записью. Проверьте чтение и, если разрешено, создание и удаление тестового файла. Затем проверьте отказ для записи без доступа. Перед изменениями сохраните smb.conf и ACL; резервная копия .bak не заменяет резервную копию данных.</w:t>
-      </w:r>
-    </w:p>
-    <w:p>
-      <w:r>
-        <w:br w:type="page"/>
-      </w:r>
-    </w:p>
-    <w:p>
-      <w:pPr>
-        <w:pStyle w:val="Heading1"/>
-      </w:pPr>
-      <w:r>
-        <w:t>Разделы и обслуживание</w:t>
-      </w:r>
-    </w:p>
-    <w:p>
-      <w:pPr>
-        <w:pStyle w:val="Heading2"/>
-      </w:pPr>
-      <w:r>
-        <w:t>Просмотр состояния домена</w:t>
-      </w:r>
-    </w:p>
-    <w:p>
-      <w:r>
-        <w:t>Дерево «Компьютеров» и OU позволяет выбирать объекты, переносить и удалять их. «Домен», «Репликация», «Сайты» и «Доверия» содержат формы административных операций. Права проверяются на сервере. Для CLI: sambaadm &lt;команда&gt; --help.</w:t>
-      </w:r>
-    </w:p>
-    <w:p>
-      <w:pPr>
-        <w:pStyle w:val="Heading2"/>
-      </w:pPr>
-      <w:r>
-        <w:t>Групповые политики</w:t>
-      </w:r>
-    </w:p>
-    <w:p>
-      <w:r>
-        <w:t>В GPO отображаются имя, GUID и источник. Кнопка Distribute запускает доставку политики на контроллеры и показывает ход задания. Перед запуском проверьте резервную копию, путь SYSVOL и настройки gpo в YAML. Для операций нужны samba-tool, а при rsync — rsync, SSH и права на удалённых контроллерах. Успех доставки проверяйте по итогам всех шагов задания.</w:t>
-      </w:r>
-    </w:p>
-    <w:p>
-      <w:pPr>
-        <w:pStyle w:val="Heading2"/>
-      </w:pPr>
-      <w:r>
-        <w:t>Принтеры</w:t>
-      </w:r>
-    </w:p>
-    <w:p>
-      <w:r>
-        <w:t>В разделе принтеров откройте создание, задайте Name, существующую CUPS queue, путь очереди и комментарий. Сначала настройте печать на сервере CUPS. Для обнаружения очередей используется lpstat; права процесса на smb.conf и каталог очереди также обязательны.</w:t>
-      </w:r>
-    </w:p>
-    <w:p>
-      <w:pPr>
-        <w:pStyle w:val="Heading2"/>
-      </w:pPr>
-      <w:r>
-        <w:t>Постоянный запуск через systemd</w:t>
-      </w:r>
-    </w:p>
-    <w:p>
-      <w:r>
-        <w:t>В проекте есть deploy/sambaadm.service. Он запускает процесс от пользователя sambaadm и разрешает запись только в /var/log/sambaadm. Создайте системного пользователя и назначьте права на каталог журнала перед запуском. Секреты задайте в /etc/sambaadm/env с правами 0600.</w:t>
-      </w:r>
-    </w:p>
-    <w:p>
-      <w:pPr>
-        <w:spacing w:after="20" w:line="240" w:lineRule="auto"/>
-      </w:pPr>
-      <w:r>
-        <w:rPr>
-          <w:rFonts w:ascii="Courier New" w:hAnsi="Courier New"/>
-          <w:sz w:val="17"/>
-        </w:rPr>
-        <w:t>sudo install -m 644 deploy/sambaadm.service /etc/systemd/system/</w:t>
-      </w:r>
-    </w:p>
-    <w:p>
-      <w:pPr>
-        <w:spacing w:after="20" w:line="240" w:lineRule="auto"/>
-      </w:pPr>
-      <w:r>
-        <w:rPr>
-          <w:rFonts w:ascii="Courier New" w:hAnsi="Courier New"/>
-          <w:sz w:val="17"/>
-        </w:rPr>
-        <w:t>sudo systemctl daemon-reload</w:t>
-      </w:r>
-    </w:p>
-    <w:p>
-      <w:pPr>
-        <w:spacing w:after="20" w:line="240" w:lineRule="auto"/>
-      </w:pPr>
-      <w:r>
-        <w:rPr>
-          <w:rFonts w:ascii="Courier New" w:hAnsi="Courier New"/>
-          <w:sz w:val="17"/>
-        </w:rPr>
-        <w:t>sudo systemctl enable --now sambaadm</w:t>
-      </w:r>
-    </w:p>
-    <w:p>
-      <w:pPr>
-        <w:spacing w:after="20" w:line="240" w:lineRule="auto"/>
-      </w:pPr>
-      <w:r>
-        <w:rPr>
-          <w:rFonts w:ascii="Courier New" w:hAnsi="Courier New"/>
-          <w:sz w:val="17"/>
-        </w:rPr>
-        <w:t>sudo systemctl status sambaadm</w:t>
-      </w:r>
-    </w:p>
-    <w:p>
-      <w:pPr>
-        <w:spacing w:after="20" w:line="240" w:lineRule="auto"/>
-      </w:pPr>
-      <w:r>
-        <w:rPr>
-          <w:rFonts w:ascii="Courier New" w:hAnsi="Courier New"/>
-          <w:sz w:val="17"/>
-        </w:rPr>
-        <w:t>sudo journalctl -u sambaadm -n 100 --no-pager</w:t>
-      </w:r>
-    </w:p>
-    <w:p>
-      <w:r>
-        <w:t>Перед включением сервиса остановите ручной запуск, чтобы освободить порт. Unit по умолчанию не даёт записывать smb.conf, SYSVOL и каталоги общих папок. Для таких операций отдельно настройте права ОС и ограничения systemd; одного назначения роли admin недостаточно. Имя службы Samba в ALT сверьте с установленным пакетом.</w:t>
-      </w:r>
-    </w:p>
-    <w:p>
-      <w:pPr>
-        <w:pStyle w:val="Heading2"/>
-      </w:pPr>
-      <w:r>
-        <w:t>Аудит и обновления</w:t>
-      </w:r>
-    </w:p>
-    <w:p>
-      <w:r>
-        <w:t>Раздел «Аудит» и audit.file предназначены для проверки действий. Периодически проверяйте ошибки, объём журнала и настройте ротацию. /healthz подтверждает работу HTTP, но не исправность домена. Перед обновлением сохраните конфиг и старый бинарник, остановите сервис, замените файл, запустите и проверьте вход и чтение объектов.</w:t>
-      </w:r>
-    </w:p>
-    <w:p>
-      <w:r>
-        <w:br w:type="page"/>
-      </w:r>
-    </w:p>
-    <w:p>
-      <w:pPr>
-        <w:pStyle w:val="Heading1"/>
-      </w:pPr>
-      <w:r>
-        <w:t>Устранение ошибок</w:t>
-      </w:r>
-    </w:p>
-    <w:p>
-      <w:pPr>
-        <w:pStyle w:val="Heading2"/>
-      </w:pPr>
-      <w:r>
-        <w:t>Страница не открывается</w:t>
-      </w:r>
-    </w:p>
-    <w:p>
-      <w:r>
-        <w:t>Проверьте, запущен ли процесс и совпадает ли порт в адресе с --listen. Для сервера на другой машине используйте его IP вместо localhost. При удалённом доступе проверьте интерфейс прослушивания и межсетевой экран.</w:t>
-      </w:r>
-    </w:p>
-    <w:p>
-      <w:pPr>
-        <w:spacing w:after="20" w:line="240" w:lineRule="auto"/>
-      </w:pPr>
-      <w:r>
-        <w:rPr>
-          <w:rFonts w:ascii="Courier New" w:hAnsi="Courier New"/>
-          <w:sz w:val="17"/>
-        </w:rPr>
-        <w:t>curl -i http://127.0.0.1:8081/healthz</w:t>
-      </w:r>
-    </w:p>
-    <w:p>
-      <w:pPr>
-        <w:spacing w:after="20" w:line="240" w:lineRule="auto"/>
-      </w:pPr>
-      <w:r>
-        <w:rPr>
-          <w:rFonts w:ascii="Courier New" w:hAnsi="Courier New"/>
-          <w:sz w:val="17"/>
-        </w:rPr>
-        <w:t>systemctl status sambaadm</w:t>
-      </w:r>
-    </w:p>
-    <w:p>
-      <w:pPr>
-        <w:spacing w:after="20" w:line="240" w:lineRule="auto"/>
-      </w:pPr>
-      <w:r>
-        <w:rPr>
-          <w:rFonts w:ascii="Courier New" w:hAnsi="Courier New"/>
-          <w:sz w:val="17"/>
-        </w:rPr>
-        <w:t>journalctl -u sambaadm -n 100 --no-pager</w:t>
-      </w:r>
-    </w:p>
-    <w:p>
-      <w:pPr>
-        <w:pStyle w:val="Heading2"/>
-      </w:pPr>
-      <w:r>
-        <w:t>GLIBC_2.34 not found или неверный формат файла</w:t>
-      </w:r>
-    </w:p>
-    <w:p>
-      <w:r>
-        <w:t>Замените старый файл на статический sambaadm-linux-amd64 из новой сборки. На Linux выполните file sambaadm-linux-amd64: ожидается ELF x86-64, statically linked. Для Mac используйте Darwin-сборку. При Permission denied проверьте chmod +x и отсутствие noexec на файловой системе.</w:t>
-      </w:r>
-    </w:p>
-    <w:p>
-      <w:pPr>
-        <w:pStyle w:val="Heading2"/>
-      </w:pPr>
-      <w:r>
-        <w:t>Ошибка подключения к LDAP</w:t>
-      </w:r>
-    </w:p>
-    <w:p>
-      <w:r>
-        <w:t>Проверьте ldap.uri, DNS и доступность контроллера с сервера приложения. На Mac локальный ldapi-сокет Samba обычно отсутствует — настройте LDAPS на действующий контроллер. При ошибке x509 проверьте имя в сертификате, срок действия, время ОС и доверие к центру сертификации.</w:t>
-      </w:r>
-    </w:p>
-    <w:p>
-      <w:pPr>
-        <w:pStyle w:val="Heading2"/>
-      </w:pPr>
-      <w:r>
-        <w:t>Неверный пароль или недостаточно прав</w:t>
-      </w:r>
-    </w:p>
-    <w:p>
-      <w:r>
-        <w:t>Используйте UPN и пароль доменной записи. Проверьте, что запись активна. При отказе операции проверьте роль, точные DN групп, полномочия в AD и пароль служебной записи в окружении процесса. После изменения окружения systemd перезапустите сервис. Не публикуйте пароль в снимках экрана и журналах.</w:t>
-      </w:r>
-    </w:p>
-    <w:p>
-      <w:pPr>
-        <w:pStyle w:val="Heading2"/>
-      </w:pPr>
-      <w:r>
-        <w:t>Папка не создаётся или ACL не применяется</w:t>
-      </w:r>
-    </w:p>
-    <w:p>
-      <w:r>
-        <w:t>Проверьте shares_root, владельца каталогов, наличие утилит, права на smb.conf и ReadWritePaths в unit. Результат операции нужно проверить на файловой системе и с клиентской машины. При ошибке CSRF обновите страницу и повторите вход; не отключайте защиту.</w:t>
-      </w:r>
-    </w:p>
-    <w:p>
-      <w:pPr>
-        <w:pStyle w:val="Heading2"/>
-      </w:pPr>
-      <w:r>
-        <w:t>Что собрать для диагностики</w:t>
-      </w:r>
-    </w:p>
-    <w:p>
-      <w:r>
-        <w:t>Версию sambaadm, ОС и архитектуру, команду запуска без секретов, URL, точное сообщение ошибки, время сбоя и соответствующие строки журнала. Приложите обезличенный config.yaml. Перед передачей удалите пароли и другие закрытые данные.</w:t>
-      </w:r>
-    </w:p>
-    <w:p>
-      <w:pPr>
-        <w:pStyle w:val="Heading2"/>
-      </w:pPr>
-      <w:r>
-        <w:t>Контроль после настройки</w:t>
-      </w:r>
-    </w:p>
-    <w:p>
-      <w:r>
-        <w:t>Страница открывается; доменная запись входит; роль соответствует группе; пользователи читаются; разрешённая операция проходит; запрещённая отклоняется; аудит фиксирует действия. Linux-сборка проверена на отсутствие зависимости от glibc; проверку полного рабочего сценария выполните на своём ALT и домене.</w:t>
-      </w:r>
-    </w:p>
-    <w:p>
-      <w:r>
-        <w:br w:type="page"/>
-      </w:r>
-    </w:p>
-    <w:p>
-      <w:pPr>
-        <w:pStyle w:val="Heading1"/>
-      </w:pPr>
-      <w:r>
-        <w:t>Список и дерево пользователей</w:t>
-      </w:r>
-    </w:p>
-    <w:p>
-      <w:r>
-        <w:t>Откройте «Пользователи» (/users). Слева — раскрывающееся дерево домена, OU, контейнеров и пользователей. Справа — список с логином, именем, состоянием, DN и операциями. Выбор ветви фильтрует список по её объектам и вложенным подразделениям.</w:t>
-      </w:r>
-    </w:p>
-    <w:p>
-      <w:r>
-        <w:drawing>
-          <wp:inline xmlns:a="http://schemas.openxmlformats.org/drawingml/2006/main" xmlns:pic="http://schemas.openxmlformats.org/drawingml/2006/picture">
-            <wp:extent cx="5943600" cy="2311400"/>
-            <wp:docPr id="5" name="Picture 5"/>
-            <wp:cNvGraphicFramePr>
-              <a:graphicFrameLocks noChangeAspect="1"/>
-            </wp:cNvGraphicFramePr>
-            <a:graphic>
-              <a:graphicData uri="http://schemas.openxmlformats.org/drawingml/2006/picture">
-                <pic:pic>
-                  <pic:nvPicPr>
-                    <pic:cNvPr id="0" name="user-list.png"/>
-                    <pic:cNvPicPr/>
-                  </pic:nvPicPr>
-                  <pic:blipFill>
-                    <a:blip r:embed="rId14"/>
-                    <a:stretch>
-                      <a:fillRect/>
-                    </a:stretch>
-                  </pic:blipFill>
-                  <pic:spPr>
-                    <a:xfrm>
-                      <a:off x="0" y="0"/>
-                      <a:ext cx="5943600" cy="2311400"/>
-                    </a:xfrm>
-                    <a:prstGeom prst="rect"/>
-                  </pic:spPr>
-                </pic:pic>
-              </a:graphicData>
-            </a:graphic>
-          </wp:inline>
-        </w:drawing>
-      </w:r>
-    </w:p>
-    <w:p>
-      <w:r>
-        <w:t>Рисунок 5. Текущий веб-интерфейс пользователей с учебными данными теста.</w:t>
-      </w:r>
-    </w:p>
-    <w:p>
-      <w:r>
-        <w:drawing>
-          <wp:inline xmlns:a="http://schemas.openxmlformats.org/drawingml/2006/main" xmlns:pic="http://schemas.openxmlformats.org/drawingml/2006/picture">
-            <wp:extent cx="5943600" cy="1995351"/>
-            <wp:docPr id="6" name="Picture 6"/>
-            <wp:cNvGraphicFramePr>
-              <a:graphicFrameLocks noChangeAspect="1"/>
-            </wp:cNvGraphicFramePr>
-            <a:graphic>
-              <a:graphicData uri="http://schemas.openxmlformats.org/drawingml/2006/picture">
-                <pic:pic>
-                  <pic:nvPicPr>
-                    <pic:cNvPr id="0" name="users-tree.png"/>
-                    <pic:cNvPicPr/>
-                  </pic:nvPicPr>
-                  <pic:blipFill>
-                    <a:blip r:embed="rId15"/>
-                    <a:stretch>
-                      <a:fillRect/>
-                    </a:stretch>
-                  </pic:blipFill>
-                  <pic:spPr>
-                    <a:xfrm>
-                      <a:off x="0" y="0"/>
-                      <a:ext cx="5943600" cy="1995351"/>
-                    </a:xfrm>
-                    <a:prstGeom prst="rect"/>
-                  </pic:spPr>
-                </pic:pic>
-              </a:graphicData>
-            </a:graphic>
-          </wp:inline>
-        </w:drawing>
-      </w:r>
-    </w:p>
-    <w:p>
-      <w:r>
-        <w:t>Рисунок 6. Схема размещения объектов. В интерфейсе дерево раскрывается слева.</w:t>
-      </w:r>
-    </w:p>
-    <w:p>
-      <w:pPr>
-        <w:pStyle w:val="Heading2"/>
-      </w:pPr>
-      <w:r>
-        <w:t>Как найти пользователя и его подразделение</w:t>
-      </w:r>
-    </w:p>
-    <w:p>
-      <w:r>
-        <w:t>1. Раскройте подразделение слева и выберите контейнер или пользователя. Введите часть имени, логина или DN и нажмите «Найти». Поиск фильтрует загруженный список. «Все объекты» снимает выбор ветви; «Обновить» перечитывает данные.</w:t>
-      </w:r>
-    </w:p>
-    <w:p>
-      <w:r>
-        <w:t>2. Прочитайте DN: CN=Иван Иванов,OU=People,DC=example,DC=com означает запись внутри People домена example.com. OU может быть вложенным; CN=Users является контейнером, а не OU.</w:t>
-      </w:r>
-    </w:p>
-    <w:p>
-      <w:r>
-        <w:t>3. Структуру также можно посмотреть через CLI ou tree. Для пользователей OU используйте user list --ou. Выборка включает вложенные подразделения.</w:t>
-      </w:r>
-    </w:p>
-    <w:p>
-      <w:pPr>
-        <w:spacing w:after="20" w:line="240" w:lineRule="auto"/>
-      </w:pPr>
-      <w:r>
-        <w:rPr>
-          <w:rFonts w:ascii="Courier New" w:hAnsi="Courier New"/>
-          <w:sz w:val="17"/>
-        </w:rPr>
-        <w:t>sambaadm --config /etc/sambaadm/config.yaml ou tree</w:t>
-      </w:r>
-    </w:p>
-    <w:p>
-      <w:pPr>
-        <w:spacing w:after="20" w:line="240" w:lineRule="auto"/>
-      </w:pPr>
-      <w:r>
-        <w:rPr>
-          <w:rFonts w:ascii="Courier New" w:hAnsi="Courier New"/>
-          <w:sz w:val="17"/>
-        </w:rPr>
-        <w:t>sambaadm --config /etc/sambaadm/config.yaml user show ivanov</w:t>
-      </w:r>
-    </w:p>
-    <w:p>
-      <w:pPr>
-        <w:spacing w:after="20" w:line="240" w:lineRule="auto"/>
-      </w:pPr>
-      <w:r>
-        <w:rPr>
-          <w:rFonts w:ascii="Courier New" w:hAnsi="Courier New"/>
-          <w:sz w:val="17"/>
-        </w:rPr>
-        <w:t>sambaadm --config /etc/sambaadm/config.yaml user list \</w:t>
-      </w:r>
-    </w:p>
-    <w:p>
-      <w:pPr>
-        <w:spacing w:after="20" w:line="240" w:lineRule="auto"/>
-      </w:pPr>
-      <w:r>
-        <w:rPr>
-          <w:rFonts w:ascii="Courier New" w:hAnsi="Courier New"/>
-          <w:sz w:val="17"/>
-        </w:rPr>
-        <w:t xml:space="preserve">  --ou="OU=People,DC=example,DC=com"</w:t>
-      </w:r>
-    </w:p>
-    <w:p>
-      <w:r>
-        <w:br w:type="page"/>
-      </w:r>
-    </w:p>
-    <w:p>
-      <w:pPr>
-        <w:pStyle w:val="Heading1"/>
-      </w:pPr>
-      <w:r>
-        <w:t>Операции с пользователями</w:t>
-      </w:r>
-    </w:p>
-    <w:p>
-      <w:r>
-        <w:t>Следующие примеры выполняйте в Bash на административном сервере. Конфиг и SAMBAADM_PASSWORD должны быть заданы. Для краткости определите функцию:</w:t>
-      </w:r>
-    </w:p>
-    <w:p>
-      <w:pPr>
-        <w:spacing w:after="20" w:line="240" w:lineRule="auto"/>
-      </w:pPr>
-      <w:r>
-        <w:rPr>
-          <w:rFonts w:ascii="Courier New" w:hAnsi="Courier New"/>
-          <w:sz w:val="17"/>
-        </w:rPr>
-        <w:t>sa() { sambaadm --config /etc/sambaadm/config.yaml "$@"; }</w:t>
-      </w:r>
-    </w:p>
-    <w:p>
-      <w:pPr>
-        <w:pStyle w:val="Heading2"/>
-      </w:pPr>
-      <w:r>
-        <w:t>Просмотр и создание</w:t>
-      </w:r>
-    </w:p>
-    <w:p>
-      <w:r>
-        <w:t>В веб-интерфейсе выберите «Свойства» для записи или «Создать пользователя» для новой учётной записи. Через CLI можно получить ту же запись и создать пользователя с интерактивным вводом пароля:</w:t>
-      </w:r>
-    </w:p>
-    <w:p>
-      <w:pPr>
-        <w:spacing w:after="20" w:line="240" w:lineRule="auto"/>
-      </w:pPr>
-      <w:r>
-        <w:rPr>
-          <w:rFonts w:ascii="Courier New" w:hAnsi="Courier New"/>
-          <w:sz w:val="17"/>
-        </w:rPr>
-        <w:t>sa user show ivanov</w:t>
-      </w:r>
-    </w:p>
-    <w:p>
-      <w:pPr>
-        <w:spacing w:after="20" w:line="240" w:lineRule="auto"/>
-      </w:pPr>
-      <w:r>
-        <w:rPr>
-          <w:rFonts w:ascii="Courier New" w:hAnsi="Courier New"/>
-          <w:sz w:val="17"/>
-        </w:rPr>
-        <w:t>sa user create --login=ivanov --display="Иван Иванов" \</w:t>
-      </w:r>
-    </w:p>
-    <w:p>
-      <w:pPr>
-        <w:spacing w:after="20" w:line="240" w:lineRule="auto"/>
-      </w:pPr>
-      <w:r>
-        <w:rPr>
-          <w:rFonts w:ascii="Courier New" w:hAnsi="Courier New"/>
-          <w:sz w:val="17"/>
-        </w:rPr>
-        <w:t xml:space="preserve">  --ou="OU=People,DC=example,DC=com" --prompt</w:t>
-      </w:r>
-    </w:p>
-    <w:p>
-      <w:r>
-        <w:t>Перед созданием убедитесь, что логин свободен и OU существует. После создания проверьте Login, Enabled и DN в списке. Изменения применяются в реальном AD.</w:t>
-      </w:r>
-    </w:p>
-    <w:p>
-      <w:pPr>
-        <w:pStyle w:val="Heading2"/>
-      </w:pPr>
-      <w:r>
-        <w:t>Отключение и включение</w:t>
-      </w:r>
-    </w:p>
-    <w:p>
-      <w:r>
-        <w:t>В веб-списке нажмите «Отключить» или «Включить». Сверьте логин и DN перед нажатием. Эти действия доступны admin и helpdesk; фактический результат зависит от прав в AD. Эквивалент CLI:</w:t>
-      </w:r>
-    </w:p>
-    <w:p>
-      <w:pPr>
-        <w:spacing w:after="20" w:line="240" w:lineRule="auto"/>
-      </w:pPr>
-      <w:r>
-        <w:rPr>
-          <w:rFonts w:ascii="Courier New" w:hAnsi="Courier New"/>
-          <w:sz w:val="17"/>
-        </w:rPr>
-        <w:t>sa user disable ivanov</w:t>
-      </w:r>
-    </w:p>
-    <w:p>
-      <w:pPr>
-        <w:spacing w:after="20" w:line="240" w:lineRule="auto"/>
-      </w:pPr>
-      <w:r>
-        <w:rPr>
-          <w:rFonts w:ascii="Courier New" w:hAnsi="Courier New"/>
-          <w:sz w:val="17"/>
-        </w:rPr>
-        <w:t>sa user enable ivanov</w:t>
-      </w:r>
-    </w:p>
-    <w:p>
-      <w:pPr>
-        <w:pStyle w:val="Heading2"/>
-      </w:pPr>
-      <w:r>
-        <w:t>Сброс пароля</w:t>
-      </w:r>
-    </w:p>
-    <w:p>
-      <w:r>
-        <w:t>Нажмите «Сбросить пароль», введите новый пароль дважды и выполните операцию. Поля очищаются после успеха. Для изменения unicodePwd используйте LDAPS с доверенным сертификатом. Samba может отклонять simple bind через ldapi.</w:t>
-      </w:r>
-    </w:p>
-    <w:p>
-      <w:pPr>
-        <w:spacing w:after="20" w:line="240" w:lineRule="auto"/>
-      </w:pPr>
-      <w:r>
-        <w:rPr>
-          <w:rFonts w:ascii="Courier New" w:hAnsi="Courier New"/>
-          <w:sz w:val="17"/>
-        </w:rPr>
-        <w:t>sa user set-password ivanov</w:t>
-      </w:r>
-    </w:p>
-    <w:p>
-      <w:pPr>
-        <w:pStyle w:val="Heading2"/>
-      </w:pPr>
-      <w:r>
-        <w:t>Перемещение и членство в группах</w:t>
-      </w:r>
-    </w:p>
-    <w:p>
-      <w:r>
-        <w:t>Нажмите «Переместить» и выберите или введите целевой OU DN. Перенос может изменить действие GPO. Проверьте новый DN в свойствах. Членство меняется в разделе «Группы» по актуальному DN участника. Эквивалент CLI:</w:t>
-      </w:r>
-    </w:p>
-    <w:p>
-      <w:pPr>
-        <w:spacing w:after="20" w:line="240" w:lineRule="auto"/>
-      </w:pPr>
-      <w:r>
-        <w:rPr>
-          <w:rFonts w:ascii="Courier New" w:hAnsi="Courier New"/>
-          <w:sz w:val="17"/>
-        </w:rPr>
-        <w:t>sa user move ivanov --to-ou="OU=Finance,DC=example,DC=com"</w:t>
-      </w:r>
-    </w:p>
-    <w:p>
-      <w:pPr>
-        <w:spacing w:after="20" w:line="240" w:lineRule="auto"/>
-      </w:pPr>
-      <w:r>
-        <w:rPr>
-          <w:rFonts w:ascii="Courier New" w:hAnsi="Courier New"/>
-          <w:sz w:val="17"/>
-        </w:rPr>
-        <w:t>sa user show ivanov</w:t>
-      </w:r>
-    </w:p>
-    <w:p>
-      <w:pPr>
-        <w:spacing w:after="20" w:line="240" w:lineRule="auto"/>
-      </w:pPr>
-      <w:r>
-        <w:rPr>
-          <w:rFonts w:ascii="Courier New" w:hAnsi="Courier New"/>
-          <w:sz w:val="17"/>
-        </w:rPr>
-        <w:t>sa group add-member Finance "CN=Иван Иванов,OU=Finance,DC=example,DC=com"</w:t>
-      </w:r>
-    </w:p>
-    <w:p>
-      <w:pPr>
-        <w:spacing w:after="20" w:line="240" w:lineRule="auto"/>
-      </w:pPr>
-      <w:r>
-        <w:rPr>
-          <w:rFonts w:ascii="Courier New" w:hAnsi="Courier New"/>
-          <w:sz w:val="17"/>
-        </w:rPr>
-        <w:t>sa group members Finance</w:t>
-      </w:r>
-    </w:p>
-    <w:p>
-      <w:pPr>
-        <w:pStyle w:val="Heading2"/>
-      </w:pPr>
-      <w:r>
-        <w:t>Удаление</w:t>
-      </w:r>
-    </w:p>
-    <w:p>
-      <w:r>
-        <w:t>Нажмите «Удалить», проверьте выбранную запись и отметьте подтверждение. CLI: sa user delete ivanov. Удаление может нарушить доступ по SID. Удаляйте после проверки заявки и резервного копирования; новая запись с тем же логином не восстанавливает прежний SID.</w:t>
-      </w:r>
-    </w:p>
-    <w:p>
-      <w:r>
-        <w:t>Роли веб-интерфейса не являются отдельной защитой локального CLI. Ограничивайте доступ к конфигу, окружению и служебной учётной записи средствами ОС и AD.</w:t>
-      </w:r>
-    </w:p>
-    <w:p>
-      <w:r>
-        <w:br w:type="page"/>
-      </w:r>
-    </w:p>
-    <w:p>
-      <w:pPr>
-        <w:pStyle w:val="Heading1"/>
-      </w:pPr>
-      <w:r>
-        <w:t>Дерево и операции DNS</w:t>
-      </w:r>
-    </w:p>
-    <w:p>
-      <w:r>
-        <w:drawing>
-          <wp:inline xmlns:a="http://schemas.openxmlformats.org/drawingml/2006/main" xmlns:pic="http://schemas.openxmlformats.org/drawingml/2006/picture">
-            <wp:extent cx="5943600" cy="1995351"/>
-            <wp:docPr id="7" name="Picture 7"/>
-            <wp:cNvGraphicFramePr>
-              <a:graphicFrameLocks noChangeAspect="1"/>
-            </wp:cNvGraphicFramePr>
-            <a:graphic>
-              <a:graphicData uri="http://schemas.openxmlformats.org/drawingml/2006/picture">
-                <pic:pic>
-                  <pic:nvPicPr>
-                    <pic:cNvPr id="0" name="dns-tree.png"/>
-                    <pic:cNvPicPr/>
-                  </pic:nvPicPr>
-                  <pic:blipFill>
-                    <a:blip r:embed="rId16"/>
-                    <a:stretch>
-                      <a:fillRect/>
-                    </a:stretch>
-                  </pic:blipFill>
-                  <pic:spPr>
-                    <a:xfrm>
-                      <a:off x="0" y="0"/>
-                      <a:ext cx="5943600" cy="1995351"/>
-                    </a:xfrm>
-                    <a:prstGeom prst="rect"/>
-                  </pic:spPr>
-                </pic:pic>
-              </a:graphicData>
-            </a:graphic>
-          </wp:inline>
-        </w:drawing>
-      </w:r>
-    </w:p>
-    <w:p>
-      <w:r>
-        <w:rPr>
-          <w:i/>
-          <w:sz w:val="18"/>
-        </w:rPr>
-        <w:t>Рисунок 7. Иерархия DNS на учебном примере. Адреса 192.0.2.0/24 замените своими.</w:t>
-      </w:r>
-    </w:p>
-    <w:p>
-      <w:r>
-        <w:t>В разделе DNS (/dns) раскройте зону и «Имена записей», выберите имя и нажмите «Показать». Можно запросить имя вручную через «Записи». Дерево использует DNS-разделы LDAP; операции записей — samba-tool на сервере приложения.</w:t>
-      </w:r>
-    </w:p>
-    <w:p>
-      <w:pPr>
-        <w:pStyle w:val="Heading2"/>
-      </w:pPr>
-      <w:r>
-        <w:t>Просмотр зоны и записей</w:t>
-      </w:r>
-    </w:p>
-    <w:p>
-      <w:r>
-        <w:t>Используйте функцию sa со страницы 10. Имя files задаётся относительно зоны example.com, а не как полное доменное имя.</w:t>
-      </w:r>
-    </w:p>
-    <w:p>
-      <w:pPr>
-        <w:spacing w:after="20" w:line="240" w:lineRule="auto"/>
-      </w:pPr>
-      <w:r>
-        <w:rPr>
-          <w:rFonts w:ascii="Courier New" w:hAnsi="Courier New"/>
-          <w:sz w:val="17"/>
-        </w:rPr>
-        <w:t>sa dns zone list</w:t>
-      </w:r>
-    </w:p>
-    <w:p>
-      <w:pPr>
-        <w:spacing w:after="20" w:line="240" w:lineRule="auto"/>
-      </w:pPr>
-      <w:r>
-        <w:rPr>
-          <w:rFonts w:ascii="Courier New" w:hAnsi="Courier New"/>
-          <w:sz w:val="17"/>
-        </w:rPr>
-        <w:t>sa dns record query --zone=example.com --name=files --type=A</w:t>
-      </w:r>
-    </w:p>
-    <w:p>
-      <w:pPr>
-        <w:pStyle w:val="Heading2"/>
-      </w:pPr>
-      <w:r>
-        <w:t>Добавление и изменение записи</w:t>
-      </w:r>
-    </w:p>
-    <w:p>
-      <w:r>
-        <w:t>Нажмите «Добавить запись» или «Изменить запись» в строке зоны. Задайте имя, тип и значение; при изменении требуется точное прежнее значение. Сначала прочитайте текущую запись. Пример CLI для тестового имени files:</w:t>
-      </w:r>
-    </w:p>
-    <w:p>
-      <w:pPr>
-        <w:spacing w:after="20" w:line="240" w:lineRule="auto"/>
-      </w:pPr>
-      <w:r>
-        <w:rPr>
-          <w:rFonts w:ascii="Courier New" w:hAnsi="Courier New"/>
-          <w:sz w:val="17"/>
-        </w:rPr>
-        <w:t>sa dns record add --zone=example.com --name=files \</w:t>
-      </w:r>
-    </w:p>
-    <w:p>
-      <w:pPr>
-        <w:spacing w:after="20" w:line="240" w:lineRule="auto"/>
-      </w:pPr>
-      <w:r>
-        <w:rPr>
-          <w:rFonts w:ascii="Courier New" w:hAnsi="Courier New"/>
-          <w:sz w:val="17"/>
-        </w:rPr>
-        <w:t xml:space="preserve">  --type=A --data=192.0.2.20</w:t>
-      </w:r>
-    </w:p>
-    <w:p>
-      <w:pPr>
-        <w:spacing w:after="20" w:line="240" w:lineRule="auto"/>
-      </w:pPr>
-      <w:r>
-        <w:rPr>
-          <w:rFonts w:ascii="Courier New" w:hAnsi="Courier New"/>
-          <w:sz w:val="17"/>
-        </w:rPr>
-        <w:t>sa dns record update --zone=example.com --name=files \</w:t>
-      </w:r>
-    </w:p>
-    <w:p>
-      <w:pPr>
-        <w:spacing w:after="20" w:line="240" w:lineRule="auto"/>
-      </w:pPr>
-      <w:r>
-        <w:rPr>
-          <w:rFonts w:ascii="Courier New" w:hAnsi="Courier New"/>
-          <w:sz w:val="17"/>
-        </w:rPr>
-        <w:t xml:space="preserve">  --type=A --old-data=192.0.2.20 --data=192.0.2.21</w:t>
-      </w:r>
-    </w:p>
-    <w:p>
-      <w:pPr>
-        <w:spacing w:after="20" w:line="240" w:lineRule="auto"/>
-      </w:pPr>
-      <w:r>
-        <w:rPr>
-          <w:rFonts w:ascii="Courier New" w:hAnsi="Courier New"/>
-          <w:sz w:val="17"/>
-        </w:rPr>
-        <w:t>sa dns record query --zone=example.com --name=files --type=A</w:t>
-      </w:r>
-    </w:p>
-    <w:p>
-      <w:pPr>
-        <w:pStyle w:val="Heading2"/>
-      </w:pPr>
-      <w:r>
-        <w:t>Удаление и работа с зонами</w:t>
-      </w:r>
-    </w:p>
-    <w:p>
-      <w:pPr>
-        <w:spacing w:after="20" w:line="240" w:lineRule="auto"/>
-      </w:pPr>
-      <w:r>
-        <w:rPr>
-          <w:rFonts w:ascii="Courier New" w:hAnsi="Courier New"/>
-          <w:sz w:val="17"/>
-        </w:rPr>
-        <w:t>sa dns record delete --zone=example.com --name=files \</w:t>
-      </w:r>
-    </w:p>
-    <w:p>
-      <w:pPr>
-        <w:spacing w:after="20" w:line="240" w:lineRule="auto"/>
-      </w:pPr>
-      <w:r>
-        <w:rPr>
-          <w:rFonts w:ascii="Courier New" w:hAnsi="Courier New"/>
-          <w:sz w:val="17"/>
-        </w:rPr>
-        <w:t xml:space="preserve">  --type=A --data=192.0.2.21</w:t>
-      </w:r>
-    </w:p>
-    <w:p>
-      <w:pPr>
-        <w:spacing w:after="20" w:line="240" w:lineRule="auto"/>
-      </w:pPr>
-      <w:r>
-        <w:rPr>
-          <w:rFonts w:ascii="Courier New" w:hAnsi="Courier New"/>
-          <w:sz w:val="17"/>
-        </w:rPr>
-        <w:t>sa dns zone create lab.example.com</w:t>
-      </w:r>
-    </w:p>
-    <w:p>
-      <w:pPr>
-        <w:spacing w:after="20" w:line="240" w:lineRule="auto"/>
-      </w:pPr>
-      <w:r>
-        <w:rPr>
-          <w:rFonts w:ascii="Courier New" w:hAnsi="Courier New"/>
-          <w:sz w:val="17"/>
-        </w:rPr>
-        <w:t>sa dns zone delete lab.example.com</w:t>
-      </w:r>
-    </w:p>
-    <w:p>
-      <w:r>
-        <w:t>«Создать зону» находится над списком; удаление записи и зоны — в строке зоны. Выполните только нужную операцию и подтвердите удаление. Не удаляйте служебные данные AD без плана. Нужны samba-tool и полномочия в домене.</w:t>
-      </w:r>
-    </w:p>
-    <w:p>
-      <w:pPr>
-        <w:pStyle w:val="Heading2"/>
-      </w:pPr>
-      <w:r>
-        <w:t>Проверка результата</w:t>
-      </w:r>
-    </w:p>
-    <w:p>
-      <w:r>
-        <w:t>Повторите query, затем проверьте разрешение имени с клиентской машины и непосредственно на нужном DNS-сервере. Пример: nslookup files.example.com &lt;IP-DNS&gt;. Учтите кэш клиента и TTL: успешный ответ CLI не означает мгновенное обновление всех клиентов.</w:t>
-      </w:r>
-    </w:p>
-    <w:p>
-      <w:r>
-        <w:br w:type="page"/>
-      </w:r>
-    </w:p>
-    <w:p>
-      <w:pPr>
-        <w:pStyle w:val="Heading1"/>
-      </w:pPr>
-      <w:r>
-        <w:t>Дерево и операции GPO</w:t>
-      </w:r>
-    </w:p>
-    <w:p>
-      <w:r>
-        <w:drawing>
-          <wp:inline xmlns:a="http://schemas.openxmlformats.org/drawingml/2006/main" xmlns:pic="http://schemas.openxmlformats.org/drawingml/2006/picture">
-            <wp:extent cx="5943600" cy="1995351"/>
-            <wp:docPr id="8" name="Picture 8"/>
-            <wp:cNvGraphicFramePr>
-              <a:graphicFrameLocks noChangeAspect="1"/>
-            </wp:cNvGraphicFramePr>
-            <a:graphic>
-              <a:graphicData uri="http://schemas.openxmlformats.org/drawingml/2006/picture">
-                <pic:pic>
-                  <pic:nvPicPr>
-                    <pic:cNvPr id="0" name="gpo-tree.png"/>
-                    <pic:cNvPicPr/>
-                  </pic:nvPicPr>
-                  <pic:blipFill>
-                    <a:blip r:embed="rId17"/>
-                    <a:stretch>
-                      <a:fillRect/>
-                    </a:stretch>
-                  </pic:blipFill>
-                  <pic:spPr>
-                    <a:xfrm>
-                      <a:off x="0" y="0"/>
-                      <a:ext cx="5943600" cy="1995351"/>
-                    </a:xfrm>
-                    <a:prstGeom prst="rect"/>
-                  </pic:spPr>
-                </pic:pic>
-              </a:graphicData>
-            </a:graphic>
-          </wp:inline>
-        </w:drawing>
-      </w:r>
-    </w:p>
-    <w:p>
-      <w:r>
-        <w:rPr>
-          <w:i/>
-          <w:sz w:val="18"/>
-        </w:rPr>
-        <w:t>Рисунок 8. Хранение политики, ссылка на OU и SYSVOL показаны отдельно.</w:t>
-      </w:r>
-    </w:p>
-    <w:p>
-      <w:r>
-        <w:t>В GPO (/gpo) слева показаны политики и домен с OU. Выберите OU для просмотра ссылок. В строке доступны свойства, привязка, отмена привязки, резервная копия, доставка и удаление. Восстановление новой GPO доступно на верхней панели.</w:t>
-      </w:r>
-    </w:p>
-    <w:p>
-      <w:pPr>
-        <w:pStyle w:val="Heading2"/>
-      </w:pPr>
-      <w:r>
-        <w:t>Просмотр и создание политики</w:t>
-      </w:r>
-    </w:p>
-    <w:p>
-      <w:pPr>
-        <w:spacing w:after="20" w:line="240" w:lineRule="auto"/>
-      </w:pPr>
-      <w:r>
-        <w:rPr>
-          <w:rFonts w:ascii="Courier New" w:hAnsi="Courier New"/>
-          <w:sz w:val="17"/>
-        </w:rPr>
-        <w:t>sa gpo list</w:t>
-      </w:r>
-    </w:p>
-    <w:p>
-      <w:pPr>
-        <w:spacing w:after="20" w:line="240" w:lineRule="auto"/>
-      </w:pPr>
-      <w:r>
-        <w:rPr>
-          <w:rFonts w:ascii="Courier New" w:hAnsi="Courier New"/>
-          <w:sz w:val="17"/>
-        </w:rPr>
-        <w:t>sa gpo show "&lt;GUID&gt;"</w:t>
-      </w:r>
-    </w:p>
-    <w:p>
-      <w:pPr>
-        <w:spacing w:after="20" w:line="240" w:lineRule="auto"/>
-      </w:pPr>
-      <w:r>
-        <w:rPr>
-          <w:rFonts w:ascii="Courier New" w:hAnsi="Courier New"/>
-          <w:sz w:val="17"/>
-        </w:rPr>
-        <w:t>sa gpo create --name="Workstation Baseline"</w:t>
-      </w:r>
-    </w:p>
-    <w:p>
-      <w:r>
-        <w:t>В веб-интерфейсе нажмите «Создать GPO» и задайте имя. Для CLI сохраните GUID из результата. Создание объекта не настраивает параметры Windows и не привязывает его к OU. Для содержимого нужен совместимый редактор GPO.</w:t>
-      </w:r>
-    </w:p>
-    <w:p>
-      <w:pPr>
-        <w:pStyle w:val="Heading2"/>
-      </w:pPr>
-      <w:r>
-        <w:t>Привязка и отмена привязки</w:t>
-      </w:r>
-    </w:p>
-    <w:p>
-      <w:pPr>
-        <w:spacing w:after="20" w:line="240" w:lineRule="auto"/>
-      </w:pPr>
-      <w:r>
-        <w:rPr>
-          <w:rFonts w:ascii="Courier New" w:hAnsi="Courier New"/>
-          <w:sz w:val="17"/>
-        </w:rPr>
-        <w:t>sa gpo link --container="OU=Workstations,DC=example,DC=com" \</w:t>
-      </w:r>
-    </w:p>
-    <w:p>
-      <w:pPr>
-        <w:spacing w:after="20" w:line="240" w:lineRule="auto"/>
-      </w:pPr>
-      <w:r>
-        <w:rPr>
-          <w:rFonts w:ascii="Courier New" w:hAnsi="Courier New"/>
-          <w:sz w:val="17"/>
-        </w:rPr>
-        <w:t xml:space="preserve">  --gpo="&lt;GUID&gt;"</w:t>
-      </w:r>
-    </w:p>
-    <w:p>
-      <w:pPr>
-        <w:spacing w:after="20" w:line="240" w:lineRule="auto"/>
-      </w:pPr>
-      <w:r>
-        <w:rPr>
-          <w:rFonts w:ascii="Courier New" w:hAnsi="Courier New"/>
-          <w:sz w:val="17"/>
-        </w:rPr>
-        <w:t>sa gpo unlink --container="OU=Workstations,DC=example,DC=com" \</w:t>
-      </w:r>
-    </w:p>
-    <w:p>
-      <w:pPr>
-        <w:spacing w:after="20" w:line="240" w:lineRule="auto"/>
-      </w:pPr>
-      <w:r>
-        <w:rPr>
-          <w:rFonts w:ascii="Courier New" w:hAnsi="Courier New"/>
-          <w:sz w:val="17"/>
-        </w:rPr>
-        <w:t xml:space="preserve">  --gpo="&lt;GUID&gt;"</w:t>
-      </w:r>
-    </w:p>
-    <w:p>
-      <w:r>
-        <w:t>В строке GPO выберите «Привязать к OU» или «Отвязать от OU» и укажите DN. Отмена привязки сохраняет политику. Для просмотра выберите OU слева. Проверьте состав объектов, наследование и фильтрацию.</w:t>
-      </w:r>
-    </w:p>
-    <w:p>
-      <w:pPr>
-        <w:pStyle w:val="Heading2"/>
-      </w:pPr>
-      <w:r>
-        <w:t>Резервная копия и восстановление</w:t>
-      </w:r>
-    </w:p>
-    <w:p>
-      <w:pPr>
-        <w:spacing w:after="20" w:line="240" w:lineRule="auto"/>
-      </w:pPr>
-      <w:r>
-        <w:rPr>
-          <w:rFonts w:ascii="Courier New" w:hAnsi="Courier New"/>
-          <w:sz w:val="17"/>
-        </w:rPr>
-        <w:t>sa gpo backup "&lt;GUID&gt;" --path=/srv/backup/gpo</w:t>
-      </w:r>
-    </w:p>
-    <w:p>
-      <w:pPr>
-        <w:spacing w:after="20" w:line="240" w:lineRule="auto"/>
-      </w:pPr>
-      <w:r>
-        <w:rPr>
-          <w:rFonts w:ascii="Courier New" w:hAnsi="Courier New"/>
-          <w:sz w:val="17"/>
-        </w:rPr>
-        <w:t>sa gpo restore "Новая политика" --path=/srv/backup/gpo/policy/{GUID}</w:t>
-      </w:r>
-    </w:p>
-    <w:p>
-      <w:r>
-        <w:t>Копия сохраняется в &lt;каталог&gt;/policy/{GUID} на сервере. Нажмите «Восстановить в новую GPO», укажите новое имя и путь к этой папке. Создаётся новая политика с новым GUID; ссылки на OU добавьте отдельно. Нужны samba-tool и подходящие полномочия.</w:t>
-      </w:r>
-    </w:p>
-    <w:p>
-      <w:pPr>
-        <w:pStyle w:val="Heading2"/>
-      </w:pPr>
-      <w:r>
-        <w:t>Доставка и проверка применения</w:t>
-      </w:r>
-    </w:p>
-    <w:p>
-      <w:pPr>
-        <w:spacing w:after="20" w:line="240" w:lineRule="auto"/>
-      </w:pPr>
-      <w:r>
-        <w:rPr>
-          <w:rFonts w:ascii="Courier New" w:hAnsi="Courier New"/>
-          <w:sz w:val="17"/>
-        </w:rPr>
-        <w:t>sa gpo distribute "&lt;GUID&gt;"</w:t>
-      </w:r>
-    </w:p>
-    <w:p>
-      <w:r>
-        <w:t>Либо нажмите «Доставить на контроллеры», подтвердите операцию и наблюдайте ход задания. Закрытие окна не отменяет доставку. Проверьте DRS, rsync и ACL. Применение на клиенте проверяется отдельно: на ALT используйте gpupdate и gpresult. Совместимость с СП 10.2.2 ещё требует проверки.</w:t>
-      </w:r>
-    </w:p>
-    <w:p>
-      <w:r>
-        <w:t>Удаление: sa gpo delete "&lt;GUID&gt;". Это удаляет объект политики, а не только ссылку. Сначала сохраните копию и проверьте, где политика используется.</w:t>
-      </w:r>
-    </w:p>
-    <w:p>
-      <w:r>
-        <w:br w:type="page"/>
-      </w:r>
-    </w:p>
-    <w:p>
-      <w:pPr>
-        <w:pStyle w:val="Heading1"/>
-      </w:pPr>
-      <w:r>
-        <w:t>Параметры служб ALT Linux</w:t>
-      </w:r>
-    </w:p>
-    <w:p>
-      <w:r>
-        <w:t>Редактор задаёт машинные политики systemd из установленного шаблона ALT. Остальные записи Registry.pol сохраняются. Применение настройки на ALT СП 10.2.2 ещё требует проверки на клиенте.</w:t>
-      </w:r>
-    </w:p>
-    <w:p>
-      <w:r>
-        <w:drawing>
-          <wp:inline xmlns:a="http://schemas.openxmlformats.org/drawingml/2006/main" xmlns:pic="http://schemas.openxmlformats.org/drawingml/2006/picture">
-            <wp:extent cx="5852160" cy="4064000"/>
-            <wp:docPr id="9" name="Picture 9"/>
-            <wp:cNvGraphicFramePr>
-              <a:graphicFrameLocks noChangeAspect="1"/>
-            </wp:cNvGraphicFramePr>
-            <a:graphic>
-              <a:graphicData uri="http://schemas.openxmlformats.org/drawingml/2006/picture">
-                <pic:pic>
-                  <pic:nvPicPr>
-                    <pic:cNvPr id="0" name="alt-editor.png"/>
-                    <pic:cNvPicPr/>
-                  </pic:nvPicPr>
-                  <pic:blipFill>
-                    <a:blip r:embed="rId18"/>
-                    <a:stretch>
-                      <a:fillRect/>
-                    </a:stretch>
-                  </pic:blipFill>
-                  <pic:spPr>
-                    <a:xfrm>
-                      <a:off x="0" y="0"/>
-                      <a:ext cx="5852160" cy="4064000"/>
+                      <a:ext cx="6120000" cy="4005818"/>
                     </a:xfrm>
                     <a:prstGeom prst="rect"/>
                   </pic:spPr>
@@ -2259,91 +499,52 @@
         <w:pStyle w:val="Caption"/>
       </w:pPr>
       <w:r>
-        <w:t>Рисунок 9. Редактор на учебных данных после сохранения настройки chronyd.service.</w:t>
-      </w:r>
-    </w:p>
-    <w:p>
-      <w:pPr>
-        <w:pStyle w:val="Heading2"/>
-      </w:pPr>
-      <w:r>
-        <w:t>Подготовка сервера</w:t>
+        <w:t>Страница входа</w:t>
       </w:r>
     </w:p>
     <w:p>
       <w:r>
-        <w:t>Работайте на writable DC с локальным SYSVOL. Укажите в конфигурации gpo.editor_enabled: true, gpo.admx_path: путь к установленному BaseALTSystemdUnits.admx и gpo.sysvol_path: путь к SYSVOL. LDAP должен указывать на этот же DC. По умолчанию редактор отключён; на Mac без локального SYSVOL он недоступен.</w:t>
-      </w:r>
-    </w:p>
-    <w:p>
-      <w:pPr>
-        <w:pStyle w:val="Heading2"/>
-      </w:pPr>
-      <w:r>
-        <w:t>Изменение политики</w:t>
-      </w:r>
-    </w:p>
-    <w:p>
-      <w:pPr>
-        <w:pStyle w:val="ListNumber"/>
-      </w:pPr>
-      <w:r>
-        <w:t>Откройте GPO и нажмите «Параметры ALT» у нужной политики.</w:t>
-      </w:r>
-    </w:p>
-    <w:p>
-      <w:pPr>
-        <w:pStyle w:val="ListNumber"/>
-      </w:pPr>
-      <w:r>
-        <w:t>Выберите службу и состояние: «Включено» — автозапуск, «Отключено» — отключение автозапуска, «Не настроено» — отсутствие этого параметра в GPO.</w:t>
-      </w:r>
-    </w:p>
-    <w:p>
-      <w:pPr>
-        <w:pStyle w:val="ListNumber"/>
-      </w:pPr>
-      <w:r>
-        <w:t>Отметьте подтверждение и нажмите «Сохранить». Сохранять может admin; другим ролям доступен просмотр. При конфликте перезагрузите параметры.</w:t>
-      </w:r>
-    </w:p>
-    <w:p>
-      <w:pPr>
-        <w:pStyle w:val="ListNumber"/>
-      </w:pPr>
-      <w:r>
-        <w:t>Привяжите GPO к OU с компьютером ALT. Проверьте gpupdate и gpresult на клиенте, затем фактическое состояние службы.</w:t>
+        <w:t>1. Откройте адрес sambaadm, полученный при установке.</w:t>
       </w:r>
     </w:p>
     <w:p>
       <w:r>
-        <w:t>Не редактируйте ту же политику одновременно в GPUI. Если остался файл .sambaadm-editor.pending, сохранение блокируется до проверки LDAP и файлов SYSVOL. Порядок восстановления описан в docs/web.md. Доставка файлов и успешное сохранение не подтверждают применение настройки на клиенте.</w:t>
+        <w:t>2. Введите UPN доменной записи, например ivanov@example.com, и её пароль. Стандартной пары admin/admin нет.</w:t>
       </w:r>
     </w:p>
     <w:p>
       <w:r>
-        <w:br w:type="page"/>
+        <w:t>3. Проверьте роль, домен и сводку на главной странице. Ошибка получения данных не означает отсутствие объектов.</w:t>
+      </w:r>
+    </w:p>
+    <w:p>
+      <w:r>
+        <w:t>4. После работы нажмите «Выйти»; после перезапуска сервера может потребоваться повторный вход.</w:t>
+      </w:r>
+    </w:p>
+    <w:p>
+      <w:r>
+        <w:t>Дашборд показывает пользователей, GPO, компьютеры, включая DC, и контроллеры текущего домена. «Обновить сводку» повторяет запрос. Ошибка RPC или отсутствие партнёров не подтверждают исправность репликации. Карта соединений также не заменяет проверку состояния.</w:t>
       </w:r>
     </w:p>
     <w:p>
       <w:pPr>
         <w:pStyle w:val="Heading1"/>
+        <w:pageBreakBefore/>
       </w:pPr>
       <w:r>
-        <w:t>Карточка пользователя</w:t>
+        <w:t>Пользователи группы и подразделения</w:t>
       </w:r>
     </w:p>
     <w:p>
-      <w:r>
-        <w:t>В разделе «Пользователи» нажмите «Свойства». Вкладка «Атрибуты» содержит основные данные и действия над учётной записью; вкладка «Группы» показывает прямое членство и основную группу AD.</w:t>
-      </w:r>
-    </w:p>
-    <w:p>
+      <w:pPr>
+        <w:keepNext/>
+      </w:pPr>
       <w:r>
         <w:drawing>
           <wp:inline xmlns:a="http://schemas.openxmlformats.org/drawingml/2006/main" xmlns:pic="http://schemas.openxmlformats.org/drawingml/2006/picture">
-            <wp:extent cx="5577840" cy="3873500"/>
-            <wp:docPr id="10" name="Picture 10"/>
+            <wp:extent cx="6120000" cy="4250000"/>
+            <wp:docPr id="2" name="Picture 2"/>
             <wp:cNvGraphicFramePr>
               <a:graphicFrameLocks noChangeAspect="1"/>
             </wp:cNvGraphicFramePr>
@@ -2355,7 +556,7 @@
                     <pic:cNvPicPr/>
                   </pic:nvPicPr>
                   <pic:blipFill>
-                    <a:blip r:embed="rId19"/>
+                    <a:blip r:embed="rId11"/>
                     <a:stretch>
                       <a:fillRect/>
                     </a:stretch>
@@ -2363,7 +564,7 @@
                   <pic:spPr>
                     <a:xfrm>
                       <a:off x="0" y="0"/>
-                      <a:ext cx="5577840" cy="3873500"/>
+                      <a:ext cx="6120000" cy="4250000"/>
                     </a:xfrm>
                     <a:prstGeom prst="rect"/>
                   </pic:spPr>
@@ -2379,77 +580,52 @@
         <w:pStyle w:val="Caption"/>
       </w:pPr>
       <w:r>
-        <w:t>Рисунок 10. Карточка пользователя на учебных данных. Для групп выберите отдельную вкладку.</w:t>
-      </w:r>
-    </w:p>
-    <w:p>
-      <w:pPr>
-        <w:pStyle w:val="Heading2"/>
-      </w:pPr>
-      <w:r>
-        <w:t>Атрибуты и состояние</w:t>
+        <w:t>Карточка пользователя и редактируемые атрибуты</w:t>
       </w:r>
     </w:p>
     <w:p>
       <w:r>
-        <w:t>Admin может изменить имя, фамилию, отображаемое имя, почту, телефон, подразделение организации, должность и описание. Нажмите «Сохранить атрибуты». Пустое поле очищает соответствующий атрибут. Логин, UPN и DN доступны для просмотра; переименования эта форма не выполняет.</w:t>
+        <w:t>В «Пользователи» выберите контейнер слева, используйте поиск и «Обновить». «Все объекты» снимает ограничение дерева. Выбор OU показывает также вложенные объекты. В карточке сверяйте логин, UPN и DN перед изменением.</w:t>
       </w:r>
     </w:p>
     <w:p>
       <w:r>
-        <w:t>«Подразделение организации» задаёт текстовый атрибут department. Для переноса в OU используйте «Переместить». Helpdesk может включать и отключать учётную запись и сбрасывать пароль; редактирование атрибутов ему недоступно.</w:t>
-      </w:r>
-    </w:p>
-    <w:p>
-      <w:pPr>
-        <w:pStyle w:val="Heading2"/>
-      </w:pPr>
-      <w:r>
-        <w:t>Членство в группах</w:t>
+        <w:t>Admin создаёт пользователя, меняет имя, почту, телефон, должность, описание и другие доступные атрибуты. Пустое поле очищает атрибут. Логин, UPN и DN в карточке не переименовываются. Текстовое поле подразделения организации не переносит объект в OU — для этого есть отдельная операция.</w:t>
       </w:r>
     </w:p>
     <w:p>
       <w:r>
-        <w:t>Перейдите на вкладку «Группы». Admin может найти группу по имени и добавить пользователя либо исключить его из прямой группы. Эти действия применяются сразу. Основная группа помечена отдельно и не имеет кнопки исключения. Вложенные группы не разворачиваются.</w:t>
-      </w:r>
-    </w:p>
-    <w:p>
-      <w:pPr>
-        <w:pStyle w:val="Heading2"/>
-      </w:pPr>
-      <w:r>
-        <w:t>Конфликт изменений</w:t>
+        <w:t>На вкладке «Группы» выберите существующую группу и добавьте пользователя; исключение доступно из прямых групп. Основная группа выделена отдельно, вложенное членство не разворачивается. Изменения членства применяются сразу.</w:t>
       </w:r>
     </w:p>
     <w:p>
       <w:r>
-        <w:t>Если другой администратор уже изменил запись, сохранение блокируется. Введённые значения остаются в форме: сохраните нужные данные, нажмите «Перезагрузить карточку», сравните изменения и повторите редактирование. Изменения атрибутов и групп попадают в аудит.</w:t>
+        <w:t>Helpdesk и admin могут включить или отключить запись и сбросить пароль с повторным вводом. Перенос в OU меняет область действия GPO. Компьютеры можно просматривать, переносить и удалять; OU — создавать, переносить и удалять, если это разрешает AD. Перед удалением убедитесь, что выбран нужный DN.</w:t>
       </w:r>
     </w:p>
     <w:p>
       <w:r>
-        <w:br w:type="page"/>
+        <w:t>При конфликте карточки сохраните нужные введённые значения, перечитайте запись и повторите изменение после сравнения. Не отправляйте старую форму многократно.</w:t>
       </w:r>
     </w:p>
     <w:p>
       <w:pPr>
         <w:pStyle w:val="Heading1"/>
+        <w:pageBreakBefore/>
       </w:pPr>
       <w:r>
-        <w:t>Сайты и контроллеры</w:t>
+        <w:t>DNS и прочие доменные операции</w:t>
       </w:r>
     </w:p>
     <w:p>
-      <w:r>
-        <w:t>Дополнение к версии 0.11.0. Откройте «Сайты → Топология сайтов»: дерево показывает контроллеры и подсети каждого сайта. Иллюстрации используют учебные данные, а не рабочий домен.</w:t>
-      </w:r>
-    </w:p>
-    <w:p>
+      <w:pPr>
+        <w:keepNext/>
+      </w:pPr>
       <w:r>
         <w:drawing>
           <wp:inline xmlns:a="http://schemas.openxmlformats.org/drawingml/2006/main" xmlns:pic="http://schemas.openxmlformats.org/drawingml/2006/picture">
-            <wp:extent cx="5760720" cy="4000500"/>
-            <wp:docPr id="11" name="Picture 11"/>
+            <wp:extent cx="6120000" cy="2054571"/>
+            <wp:docPr id="3" name="Picture 3"/>
             <wp:cNvGraphicFramePr>
               <a:graphicFrameLocks noChangeAspect="1"/>
             </wp:cNvGraphicFramePr>
@@ -2457,11 +633,11 @@
               <a:graphicData uri="http://schemas.openxmlformats.org/drawingml/2006/picture">
                 <pic:pic>
                   <pic:nvPicPr>
-                    <pic:cNvPr id="0" name="v0110-site-topology.png"/>
+                    <pic:cNvPr id="0" name="dns-tree.png"/>
                     <pic:cNvPicPr/>
                   </pic:nvPicPr>
                   <pic:blipFill>
-                    <a:blip r:embed="rId20"/>
+                    <a:blip r:embed="rId12"/>
                     <a:stretch>
                       <a:fillRect/>
                     </a:stretch>
@@ -2469,7 +645,7 @@
                   <pic:spPr>
                     <a:xfrm>
                       <a:off x="0" y="0"/>
-                      <a:ext cx="5760720" cy="4000500"/>
+                      <a:ext cx="6120000" cy="2054571"/>
                     </a:xfrm>
                     <a:prstGeom prst="rect"/>
                   </pic:spPr>
@@ -2485,64 +661,57 @@
         <w:pStyle w:val="Caption"/>
       </w:pPr>
       <w:r>
-        <w:t>Рисунок 11. Сайты с контроллерами и подсетями.</w:t>
-      </w:r>
-    </w:p>
-    <w:p>
-      <w:pPr>
-        <w:pStyle w:val="Heading2"/>
-      </w:pPr>
-      <w:r>
-        <w:t>Перенос контроллера</w:t>
+        <w:t>Дерево зон и записей DNS</w:t>
       </w:r>
     </w:p>
     <w:p>
       <w:r>
-        <w:t>Создайте целевой сайт. Откройте «Контроллеры», выберите сервер и нажмите «Перенести в сайт». Укажите существующий сайт и подтвердите операцию. Затем заново откройте список и проверьте размещение. Изменения Configuration должны дойти до остальных DC перед пересчётом их топологии.</w:t>
-      </w:r>
-    </w:p>
-    <w:p>
-      <w:pPr>
-        <w:pStyle w:val="Heading2"/>
-      </w:pPr>
-      <w:r>
-        <w:t>Подсети и удаление сайта</w:t>
+        <w:t>1. Откройте DNS, выберите зону и раскройте «Имена записей».</w:t>
       </w:r>
     </w:p>
     <w:p>
       <w:r>
-        <w:t>«Создать подсеть» принимает сетевой префикс CIDR, например 192.0.2.0/24, и имя сайта. «Переназначить подсеть» меняет её сайт. Для удаления сайта сначала перенесите его DC, переназначьте или удалите подсети и исключите сайт из Site Links. Занятый сайт удалить нельзя.</w:t>
+        <w:t>2. Выберите имя и нажмите «Показать». Если дерево недоступно по правам LDAP, используйте ручной запрос записи.</w:t>
       </w:r>
     </w:p>
     <w:p>
       <w:r>
-        <w:t>Изменения доступны роли admin. Readonly и helpdesk могут просматривать данные. При конфликте версии закройте форму, заново откройте список и повторите действие после сверки актуальных настроек.</w:t>
+        <w:t>3. Для создания задайте имя относительно зоны; @ обозначает корень. Поддерживаются A, AAAA, CNAME, MX, NS, PTR, SRV и TXT.</w:t>
       </w:r>
     </w:p>
     <w:p>
       <w:r>
-        <w:br w:type="page"/>
+        <w:t>4. Для изменения укажите точное прежнее и новое значение. Проверьте результат повторным запросом.</w:t>
+      </w:r>
+    </w:p>
+    <w:p>
+      <w:r>
+        <w:t>Форматы сложных значений: SRV — target port priority weight, MX — target preference, TXT — строка в кавычках. Удаление зоны удаляет её содержимое; служебные зоны AD не используйте для экспериментов.</w:t>
+      </w:r>
+    </w:p>
+    <w:p>
+      <w:r>
+        <w:t>«Доверия» предоставляет создание, проверку и удаление доверия. «Домен» показывает свойства и FSMO, позволяет передавать или аварийно захватывать роли и повышать функциональный уровень. Захват FSMO и повышение уровня выполняйте только по отдельному плану обслуживания домена. Подтверждение формы не проверяет все организационные условия такой операции.</w:t>
       </w:r>
     </w:p>
     <w:p>
       <w:pPr>
         <w:pStyle w:val="Heading1"/>
+        <w:pageBreakBefore/>
       </w:pPr>
       <w:r>
-        <w:t>Связи сайтов</w:t>
+        <w:t>Удалённый редактор политик ALT</w:t>
       </w:r>
     </w:p>
     <w:p>
-      <w:r>
-        <w:t>В «Сайты → Связи сайтов» доступны IP Site Links. «Создать связь сайтов» принимает имя, список сайтов через точку с запятой, стоимость и интервал. Для новой связи нужны минимум два разных сайта.</w:t>
-      </w:r>
-    </w:p>
-    <w:p>
+      <w:pPr>
+        <w:keepNext/>
+      </w:pPr>
       <w:r>
         <w:drawing>
           <wp:inline xmlns:a="http://schemas.openxmlformats.org/drawingml/2006/main" xmlns:pic="http://schemas.openxmlformats.org/drawingml/2006/picture">
-            <wp:extent cx="5760720" cy="4000500"/>
-            <wp:docPr id="12" name="Picture 12"/>
+            <wp:extent cx="6120000" cy="4675000"/>
+            <wp:docPr id="4" name="Picture 4"/>
             <wp:cNvGraphicFramePr>
               <a:graphicFrameLocks noChangeAspect="1"/>
             </wp:cNvGraphicFramePr>
@@ -2550,11 +719,11 @@
               <a:graphicData uri="http://schemas.openxmlformats.org/drawingml/2006/picture">
                 <pic:pic>
                   <pic:nvPicPr>
-                    <pic:cNvPr id="0" name="v0110-site-links.png"/>
+                    <pic:cNvPr id="0" name="alt-policy-tree.png"/>
                     <pic:cNvPicPr/>
                   </pic:nvPicPr>
                   <pic:blipFill>
-                    <a:blip r:embed="rId21"/>
+                    <a:blip r:embed="rId13"/>
                     <a:stretch>
                       <a:fillRect/>
                     </a:stretch>
@@ -2562,7 +731,7 @@
                   <pic:spPr>
                     <a:xfrm>
                       <a:off x="0" y="0"/>
-                      <a:ext cx="5760720" cy="4000500"/>
+                      <a:ext cx="6120000" cy="4675000"/>
                     </a:xfrm>
                     <a:prstGeom prst="rect"/>
                   </pic:spPr>
@@ -2578,56 +747,62 @@
         <w:pStyle w:val="Caption"/>
       </w:pPr>
       <w:r>
-        <w:t>Рисунок 12. Связи сайтов со стоимостью, интервалом и действиями.</w:t>
+        <w:t>Дерево политик ALT и форма выбранного параметра</w:t>
       </w:r>
     </w:p>
     <w:p>
       <w:r>
-        <w:t>«Настроить связь» позволяет изменить сайты, стоимость 1–32767 и интервал 15–10080 минут с шагом 15. Для удаления выберите связь и подтвердите действие. Открытая форма использует версию объекта, чтобы обнаружить изменения другого администратора.</w:t>
-      </w:r>
-    </w:p>
-    <w:p>
-      <w:pPr>
-        <w:pStyle w:val="Heading2"/>
-      </w:pPr>
-      <w:r>
-        <w:t>Ограничение расписания Site Link</w:t>
+        <w:t>В YAML включите gpo.editor_enabled и задайте gpo.smb_port: 445. LDAP и SMB должны обращаться к одному доступному writable DC. Локальный SYSVOL на Mac не требуется. Пустой gpo.admx_path означает загрузку BaseALT ADMX и ru-RU либо en-US ADML из SYSVOL/&lt;domain&gt;/Policies/PolicyDefinitions. Шаблоны не встроены в бинарник; подготовьте их отдельно. Можно указать локальный каталог или один ADMX.</w:t>
       </w:r>
     </w:p>
     <w:p>
       <w:r>
-        <w:t>В проверенной Samba 4.17 найден сбой KCC при чтении расписания Site Link: вместо schedule код читает значение siteList. Запись этого параметра в sambaadm заблокирована до проверки исправления у поставщика; существующий параметр доступен для чтения. Для расписаний отдельных соединений используйте раздел «Репликация».</w:t>
+        <w:t>1. Создайте отдельную GPO или сохраните резервную копию существующей.</w:t>
       </w:r>
     </w:p>
     <w:p>
       <w:r>
-        <w:t>Основание: исходник Samba kcc_utils.py, класс SiteLink, load_sitelink. https://github.com/samba-team/samba/blob/samba-4.17.12/python/samba/kcc/kcc_utils.py</w:t>
+        <w:t>2. Откройте «Параметры ALT», выберите Machine или User, шаблон и категорию в дереве. Поиск помогает найти параметр.</w:t>
       </w:r>
     </w:p>
     <w:p>
       <w:r>
-        <w:br w:type="page"/>
+        <w:t>3. Выберите состояние и заполните поля: текст, число, список, переключатель или вариант перечисления. Прочитайте описание и ограничения диапазона.</w:t>
+      </w:r>
+    </w:p>
+    <w:p>
+      <w:r>
+        <w:t>4. Подтвердите сохранение, затем проверьте повторное чтение и нужные ссылки GPO.</w:t>
+      </w:r>
+    </w:p>
+    <w:p>
+      <w:r>
+        <w:t>Каталог поддерживает административные политики ALT, включая параметры помимо systemd. Его состав зависит от установленных ADMX/ADML. Неподдерживаемые конструкции доступны только для чтения. Редактор Windows ADMX и GPO Preferences XML не заявлен.</w:t>
+      </w:r>
+    </w:p>
+    <w:p>
+      <w:r>
+        <w:t>Сохранение обновляет Registry.pol, версию и связанные атрибуты через SMB/LDAP. При конфликте перечитайте параметры. При .sambaadm-editor.pending прекратите изменения и разберите незавершённую операцию по docs/web.md; не удаляйте журнал вслепую. Применение на ALT СП 10.2.2 и одновременная работа с GPUI ещё требуют проверки.</w:t>
       </w:r>
     </w:p>
     <w:p>
       <w:pPr>
         <w:pStyle w:val="Heading1"/>
+        <w:pageBreakBefore/>
       </w:pPr>
       <w:r>
-        <w:t>Состояние и управление репликацией</w:t>
+        <w:t>Область действия и наследование GPO</w:t>
       </w:r>
     </w:p>
     <w:p>
-      <w:r>
-        <w:t>В «Репликация → Состояние репликации» укажите DNS контроллера или оставьте поле пустым для текущего. Список зарегистрированных DC не доказывает исправность. При отсутствии партнёров интерфейс сообщает, что состояние не подтверждено.</w:t>
-      </w:r>
-    </w:p>
-    <w:p>
+      <w:pPr>
+        <w:keepNext/>
+      </w:pPr>
       <w:r>
         <w:drawing>
           <wp:inline xmlns:a="http://schemas.openxmlformats.org/drawingml/2006/main" xmlns:pic="http://schemas.openxmlformats.org/drawingml/2006/picture">
-            <wp:extent cx="5760720" cy="4000500"/>
-            <wp:docPr id="13" name="Picture 13"/>
+            <wp:extent cx="6120000" cy="4488000"/>
+            <wp:docPr id="5" name="Picture 5"/>
             <wp:cNvGraphicFramePr>
               <a:graphicFrameLocks noChangeAspect="1"/>
             </wp:cNvGraphicFramePr>
@@ -2635,11 +810,11 @@
               <a:graphicData uri="http://schemas.openxmlformats.org/drawingml/2006/picture">
                 <pic:pic>
                   <pic:nvPicPr>
-                    <pic:cNvPr id="0" name="v0110-replication-status.png"/>
+                    <pic:cNvPr id="0" name="gpo-scope.png"/>
                     <pic:cNvPicPr/>
                   </pic:nvPicPr>
                   <pic:blipFill>
-                    <a:blip r:embed="rId22"/>
+                    <a:blip r:embed="rId14"/>
                     <a:stretch>
                       <a:fillRect/>
                     </a:stretch>
@@ -2647,7 +822,7 @@
                   <pic:spPr>
                     <a:xfrm>
                       <a:off x="0" y="0"/>
-                      <a:ext cx="5760720" cy="4000500"/>
+                      <a:ext cx="6120000" cy="4488000"/>
                     </a:xfrm>
                     <a:prstGeom prst="rect"/>
                   </pic:spPr>
@@ -2663,41 +838,458 @@
         <w:pStyle w:val="Caption"/>
       </w:pPr>
       <w:r>
-        <w:t>Рисунок 13. Результаты showrepl по партнёрам и разделам каталога.</w:t>
+        <w:t>Ссылки контейнера и предпросмотр наследования</w:t>
       </w:r>
     </w:p>
     <w:p>
       <w:r>
-        <w:t>Таблица показывает направление, партнёра, раздел, последовательные ошибки, последний успех и результат попытки. Ошибку подключения или samba-tool устраните до повторной операции. «Синхронизировать» передаёт выбранный раздел от источника к назначению; пустой раздел означает раздел домена.</w:t>
+        <w:t>1. В разделе GPO нажмите «Область действия» либо выберите домен или OU в дереве.</w:t>
+      </w:r>
+    </w:p>
+    <w:p>
+      <w:r>
+        <w:t>2. Добавьте существующую политику из списка. Кнопками вверх и вниз задайте порядок; 1 — наивысший приоритет внутри контейнера.</w:t>
+      </w:r>
+    </w:p>
+    <w:p>
+      <w:r>
+        <w:t>3. При необходимости отключите ссылку, включите принудительное применение или блокировку наследования контейнера.</w:t>
+      </w:r>
+    </w:p>
+    <w:p>
+      <w:r>
+        <w:t>4. Изучите кандидатов и причины исключения, подтвердите и сохраните изменения.</w:t>
+      </w:r>
+    </w:p>
+    <w:p>
+      <w:r>
+        <w:t>5. Проверьте ссылки повторным открытием, затем применение на тестовом клиенте.</w:t>
+      </w:r>
+    </w:p>
+    <w:p>
+      <w:r>
+        <w:t>Принудительные ссылки предков сохраняют действие через блокировку наследования. Отключённая ссылка исключается. Изменение ссылки не удаляет саму GPO. При HTTP 409 перечитайте контейнер и согласуйте изменения с другим администратором.</w:t>
+      </w:r>
+    </w:p>
+    <w:p>
+      <w:r>
+        <w:t>Предпросмотр не является RSoP: он не вычисляет сайт компьютера, токен безопасности, членство в группах, WMI, loopback и результат выполнения расширений. Разделы Machine/User и ссылка WMI отображаются отдельно. Не считайте верхний элемент списка доказательством применения настройки на конкретном компьютере.</w:t>
       </w:r>
     </w:p>
     <w:p>
       <w:pPr>
-        <w:pStyle w:val="Heading2"/>
+        <w:pStyle w:val="Heading1"/>
+        <w:pageBreakBefore/>
       </w:pPr>
       <w:r>
-        <w:t>Соединения и KCC</w:t>
+        <w:t>Фильтрация и резервные копии GPO</w:t>
+      </w:r>
+    </w:p>
+    <w:p>
+      <w:pPr>
+        <w:keepNext/>
+      </w:pPr>
+      <w:r>
+        <w:drawing>
+          <wp:inline xmlns:a="http://schemas.openxmlformats.org/drawingml/2006/main" xmlns:pic="http://schemas.openxmlformats.org/drawingml/2006/picture">
+            <wp:extent cx="6120000" cy="4488000"/>
+            <wp:docPr id="6" name="Picture 6"/>
+            <wp:cNvGraphicFramePr>
+              <a:graphicFrameLocks noChangeAspect="1"/>
+            </wp:cNvGraphicFramePr>
+            <a:graphic>
+              <a:graphicData uri="http://schemas.openxmlformats.org/drawingml/2006/picture">
+                <pic:pic>
+                  <pic:nvPicPr>
+                    <pic:cNvPr id="0" name="gpo-security.png"/>
+                    <pic:cNvPicPr/>
+                  </pic:nvPicPr>
+                  <pic:blipFill>
+                    <a:blip r:embed="rId15"/>
+                    <a:stretch>
+                      <a:fillRect/>
+                    </a:stretch>
+                  </pic:blipFill>
+                  <pic:spPr>
+                    <a:xfrm>
+                      <a:off x="0" y="0"/>
+                      <a:ext cx="6120000" cy="4488000"/>
+                    </a:xfrm>
+                    <a:prstGeom prst="rect"/>
+                  </pic:spPr>
+                </pic:pic>
+              </a:graphicData>
+            </a:graphic>
+          </wp:inline>
+        </w:drawing>
+      </w:r>
+    </w:p>
+    <w:p>
+      <w:pPr>
+        <w:pStyle w:val="Caption"/>
+      </w:pPr>
+      <w:r>
+        <w:t>DACL политики и право применения</w:t>
       </w:r>
     </w:p>
     <w:p>
       <w:r>
-        <w:t>В «Соединения репликации» можно создать ручное направление источник → назначение, включить или отключить его, задать расписание и удалить. KCC управляет автоматическими соединениями и может восстановить их. «Пересчитать топологию KCC» запускается для указанного DC после распространения изменений Configuration.</w:t>
+        <w:t>«Фильтрация безопасности» показывает SID, имя, тип ACE и право Apply Group Policy. Выберите пользователя, компьютер или группу безопасности и добавьте явное разрешение применения. Можно удалить отдельную явную разрешающую ACE этого права. Наследуемые, запрещающие и совмещённые записи оставлены для просмотра; остальные права сохраняются.</w:t>
       </w:r>
     </w:p>
     <w:p>
       <w:r>
-        <w:t>Расписание соединения содержит семь дней, начиная с воскресенья, в UTC. Пример: 08:15-12:00,13:00-18:45. Пустой день закрыт, 00:00-24:00 разрешает весь день. Шаг — 15 минут; переход через полночь разделите на два дня. Расписание сохраняется с признаком пользовательского, чтобы KCC не заменял его автоматически.</w:t>
+        <w:t>Эта операция не предоставляет Read и не меняет файловые ACL SYSVOL. Проверьте право чтения отдельно. Удаление разрешения не означает запрет: доступ может оставаться через другую группу. После изменений проверьте реальный клиент.</w:t>
       </w:r>
     </w:p>
     <w:p>
       <w:r>
-        <w:t>DRS не копирует файлы SYSVOL. Для GPO используйте отдельную доставку и проверку файлов. На стенде двух Samba DC проверены изменения топологии и передача пользователя. Применение GPO и работа сервиса непосредственно на ALT СП 10.2.2 ещё требуют приёмки.</w:t>
+        <w:t>«Резервная копия» сохраняет данные на сервере приложения. Для восстановления в новую GPO укажите имя и каталог копии, затем создайте нужные ссылки отдельно. Используется нативный формат sambaadm-backup.json; старый формат .SAMBABACKUP несовместим. Не считайте локальную копию резервированием, пока она не перенесена в защищённое хранилище и не проверено восстановление.</w:t>
+      </w:r>
+    </w:p>
+    <w:p>
+      <w:r>
+        <w:t>«Доставить на контроллеры» запускает серверное задание с прогрессом. Закрытие окна не отменяет его. gpo.sync_mode задаёт drs, smb или both. DRS передаёт каталог AD, но не файлы SYSVOL; для файлов нужна SMB-доставка. Сохранение и доставка не доказывают применение: выполните проверку gpupdate/gpresult и фактических настроек на тестовом клиенте ALT.</w:t>
+      </w:r>
+    </w:p>
+    <w:p>
+      <w:pPr>
+        <w:pStyle w:val="Heading1"/>
+        <w:pageBreakBefore/>
+      </w:pPr>
+      <w:r>
+        <w:t>Сайты и карта репликации</w:t>
+      </w:r>
+    </w:p>
+    <w:p>
+      <w:pPr>
+        <w:keepNext/>
+      </w:pPr>
+      <w:r>
+        <w:drawing>
+          <wp:inline xmlns:a="http://schemas.openxmlformats.org/drawingml/2006/main" xmlns:pic="http://schemas.openxmlformats.org/drawingml/2006/picture">
+            <wp:extent cx="6120000" cy="4250000"/>
+            <wp:docPr id="7" name="Picture 7"/>
+            <wp:cNvGraphicFramePr>
+              <a:graphicFrameLocks noChangeAspect="1"/>
+            </wp:cNvGraphicFramePr>
+            <a:graphic>
+              <a:graphicData uri="http://schemas.openxmlformats.org/drawingml/2006/picture">
+                <pic:pic>
+                  <pic:nvPicPr>
+                    <pic:cNvPr id="0" name="topology-map.png"/>
+                    <pic:cNvPicPr/>
+                  </pic:nvPicPr>
+                  <pic:blipFill>
+                    <a:blip r:embed="rId16"/>
+                    <a:stretch>
+                      <a:fillRect/>
+                    </a:stretch>
+                  </pic:blipFill>
+                  <pic:spPr>
+                    <a:xfrm>
+                      <a:off x="0" y="0"/>
+                      <a:ext cx="6120000" cy="4250000"/>
+                    </a:xfrm>
+                    <a:prstGeom prst="rect"/>
+                  </pic:spPr>
+                </pic:pic>
+              </a:graphicData>
+            </a:graphic>
+          </wp:inline>
+        </w:drawing>
+      </w:r>
+    </w:p>
+    <w:p>
+      <w:pPr>
+        <w:pStyle w:val="Caption"/>
+      </w:pPr>
+      <w:r>
+        <w:t>Карта двух контроллеров на учебных данных</w:t>
+      </w:r>
+    </w:p>
+    <w:p>
+      <w:r>
+        <w:t>В «Сайты» управляйте сайтами, подсетями CIDR, размещением DC и IP Site Links. Для связей выбирайте существующие сайты. Стоимость — 1–32767; интервал — 15–10080 минут с шагом 15. Перед удалением сайта перенесите DC, переназначьте подсети и исключите сайт из связей.</w:t>
+      </w:r>
+    </w:p>
+    <w:p>
+      <w:r>
+        <w:t>В «Репликация» или «Сайты» нажмите «Топология». Сплошная стрелка — включённое соединение, пунктир — отключённое. Для нового направления перетащите источник на назначение, нажмите два узла по очереди либо выберите DC в списках. Проверьте направление и подтвердите создание. Самосвязь и дубликат запрещены.</w:t>
+      </w:r>
+    </w:p>
+    <w:p>
+      <w:r>
+        <w:t>В списке соединений доступны включение, отключение, удаление и расписание. Расписание задаётся в UTC, начиная с воскресенья: 08:15-12:00,13:00-18:45; пустой день закрыт, 00:00-24:00 открыт. Это окно доступности, а не точное время запуска. Запись расписания Site Link отключена из-за выявленной несовместимости KCC; расписание соединения настраивается отдельно.</w:t>
+      </w:r>
+    </w:p>
+    <w:p>
+      <w:r>
+        <w:t>Проверьте состояние репликации: партнёра, раздел, последний успех и последовательные ошибки. При необходимости выполните синхронизацию раздела и пересчёт KCC после распространения Configuration. KCC может пересоздавать автоматические соединения. Карта отражает конфигурацию, а не исправность транспорта.</w:t>
+      </w:r>
+    </w:p>
+    <w:p>
+      <w:pPr>
+        <w:pStyle w:val="Heading1"/>
+        <w:pageBreakBefore/>
+      </w:pPr>
+      <w:r>
+        <w:t>Общие папки и доменные группы</w:t>
+      </w:r>
+    </w:p>
+    <w:p>
+      <w:pPr>
+        <w:keepNext/>
+        <w:jc w:val="center"/>
+      </w:pPr>
+      <w:r>
+        <w:drawing>
+          <wp:inline xmlns:a="http://schemas.openxmlformats.org/drawingml/2006/main" xmlns:pic="http://schemas.openxmlformats.org/drawingml/2006/picture">
+            <wp:extent cx="4860000" cy="4840560"/>
+            <wp:docPr id="8" name="Picture 8"/>
+            <wp:cNvGraphicFramePr>
+              <a:graphicFrameLocks noChangeAspect="1"/>
+            </wp:cNvGraphicFramePr>
+            <a:graphic>
+              <a:graphicData uri="http://schemas.openxmlformats.org/drawingml/2006/picture">
+                <pic:pic>
+                  <pic:nvPicPr>
+                    <pic:cNvPr id="0" name="share-wizard.png"/>
+                    <pic:cNvPicPr/>
+                  </pic:nvPicPr>
+                  <pic:blipFill>
+                    <a:blip r:embed="rId17"/>
+                    <a:stretch>
+                      <a:fillRect/>
+                    </a:stretch>
+                  </pic:blipFill>
+                  <pic:spPr>
+                    <a:xfrm>
+                      <a:off x="0" y="0"/>
+                      <a:ext cx="4860000" cy="4840560"/>
+                    </a:xfrm>
+                    <a:prstGeom prst="rect"/>
+                  </pic:spPr>
+                </pic:pic>
+              </a:graphicData>
+            </a:graphic>
+          </wp:inline>
+        </w:drawing>
+      </w:r>
+    </w:p>
+    <w:p>
+      <w:pPr>
+        <w:pStyle w:val="Caption"/>
+      </w:pPr>
+      <w:r>
+        <w:t>Мастер папки и обнаруженная недоступность доменных групп на Mac</w:t>
+      </w:r>
+    </w:p>
+    <w:p>
+      <w:r>
+        <w:t>1. Настройте samba.smb_conf, samba.shares_root и samba.reload_cmd на сервере приложения. Процессу нужны права на конфигурацию и каталоги.</w:t>
+      </w:r>
+    </w:p>
+    <w:p>
+      <w:r>
+        <w:t>2. Откройте «Общие папки → Создать папку», задайте имя и описание. Пустой путь использует стандартный корень.</w:t>
+      </w:r>
+    </w:p>
+    <w:p>
+      <w:r>
+        <w:t>3. Выберите режим совместной работы или чтения и группы из подключённого домена.</w:t>
+      </w:r>
+    </w:p>
+    <w:p>
+      <w:r>
+        <w:t>4. Нажмите «Рассчитать параметры». Проверьте группы, права записи, маски и файловые ACL. Технические параметры доступны в раскрываемом блоке.</w:t>
+      </w:r>
+    </w:p>
+    <w:p>
+      <w:r>
+        <w:t>5. Устраните ошибки локального разрешения групп, затем подтвердите создание и проверьте доступ с клиентского компьютера.</w:t>
+      </w:r>
+    </w:p>
+    <w:p>
+      <w:r>
+        <w:t>Группы Samba задаются квалифицированными именами домена, POSIX ACL — числовыми GID. На Linux нужны настроенные NSS/winbind, getent, setfacl и файловые права. LDAP-подключение с Mac само по себе этого не обеспечивает. Если группа не разрешается на сервере, создание блокируется — как на иллюстрации.</w:t>
+      </w:r>
+    </w:p>
+    <w:p>
+      <w:r>
+        <w:t>Доступ должен разрешаться и Samba, и файловой системой. В мастере гостевой доступ запрещён. Расширенная ручная форма остаётся отдельной ветвью. Удаление публикации по умолчанию сохраняет каталог и данные. Принтеры также локальны: публикация требует существующей очереди CUPS и доступных утилит печати.</w:t>
+      </w:r>
+    </w:p>
+    <w:p>
+      <w:pPr>
+        <w:pStyle w:val="Heading1"/>
+        <w:pageBreakBefore/>
+      </w:pPr>
+      <w:r>
+        <w:t>Профили Samba и показатели системы</w:t>
+      </w:r>
+    </w:p>
+    <w:p>
+      <w:pPr>
+        <w:keepNext/>
+      </w:pPr>
+      <w:r>
+        <w:drawing>
+          <wp:inline xmlns:a="http://schemas.openxmlformats.org/drawingml/2006/main" xmlns:pic="http://schemas.openxmlformats.org/drawingml/2006/picture">
+            <wp:extent cx="6120000" cy="4496160"/>
+            <wp:docPr id="9" name="Picture 9"/>
+            <wp:cNvGraphicFramePr>
+              <a:graphicFrameLocks noChangeAspect="1"/>
+            </wp:cNvGraphicFramePr>
+            <a:graphic>
+              <a:graphicData uri="http://schemas.openxmlformats.org/drawingml/2006/picture">
+                <pic:pic>
+                  <pic:nvPicPr>
+                    <pic:cNvPr id="0" name="host-metrics.png"/>
+                    <pic:cNvPicPr/>
+                  </pic:nvPicPr>
+                  <pic:blipFill>
+                    <a:blip r:embed="rId18"/>
+                    <a:stretch>
+                      <a:fillRect/>
+                    </a:stretch>
+                  </pic:blipFill>
+                  <pic:spPr>
+                    <a:xfrm>
+                      <a:off x="0" y="0"/>
+                      <a:ext cx="6120000" cy="4496160"/>
+                    </a:xfrm>
+                    <a:prstGeom prst="rect"/>
+                  </pic:spPr>
+                </pic:pic>
+              </a:graphicData>
+            </a:graphic>
+          </wp:inline>
+        </w:drawing>
+      </w:r>
+    </w:p>
+    <w:p>
+      <w:pPr>
+        <w:pStyle w:val="Caption"/>
+      </w:pPr>
+      <w:r>
+        <w:t>Метрики машины sambaadm на локальном Mac</w:t>
+      </w:r>
+    </w:p>
+    <w:p>
+      <w:r>
+        <w:t>В «Настройки → Профили Samba» выберите профиль и нажмите «Предпросмотр профиля». Совместимый разрешает SMB2_02 и выше с обязательной подписью. Защищённый требует SMB3_11, подпись и шифрование; старые клиенты могут потерять доступ. Это расчёт параметров по профилю, не автоматическая настройка под оборудование.</w:t>
+      </w:r>
+    </w:p>
+    <w:p>
+      <w:r>
+        <w:t>После просмотра подтвердите запись. Проверяются testparm и версия файла; сохраняется резервная копия .sambaadm-&lt;UTC timestamp&gt;.bak. Доменная роль, realm, idmap и секции папок не переписываются. include, registry backend и неоднозначная конфигурация блокируют автоматическую запись. Затем отдельно перечитайте конфигурацию Samba; некоторым параметрам нужен перезапуск службы. Для отката используйте созданную копию, повторную проверку testparm и штатное применение конфигурации.</w:t>
+      </w:r>
+    </w:p>
+    <w:p>
+      <w:r>
+        <w:t>Графики показывают CPU, занятую RAM и заполнение системного диска сервера sambaadm. Диск — не скорость ввода-вывода. Замеры идут каждые 5 секунд при открытом дашборде; хранятся последние 120 точек в памяти. Перезапуск очищает историю, скрытая вкладка не опрашивает сервер. «Нет замера» не равно нулевой нагрузке. При запуске в контейнере доступны метрики его среды, а не удалённого DC.</w:t>
+      </w:r>
+    </w:p>
+    <w:p>
+      <w:pPr>
+        <w:pStyle w:val="Heading1"/>
+        <w:pageBreakBefore/>
+      </w:pPr>
+      <w:r>
+        <w:t>Обслуживание и диагностика</w:t>
+      </w:r>
+    </w:p>
+    <w:p>
+      <w:r>
+        <w:t>Для постоянного запуска адаптируйте deploy/sambaadm.service. Создайте пользователя и группу сервиса, выдайте доступ к YAML, CA и журналу; задайте пароль в /etc/sambaadm/env с правами 0600. Шаблон сервиса разрешает запись только в /var/log/sambaadm. Для локальных папок и smb.conf отдельно настройте права ОС и ReadWritePaths; одного добавления пути недостаточно для выдачи файловых прав. После установки unit выполните daemon-reload и enable --now sambaadm.</w:t>
+      </w:r>
+    </w:p>
+    <w:p>
+      <w:pPr>
+        <w:spacing w:after="0" w:line="240" w:lineRule="auto"/>
+      </w:pPr>
+      <w:r>
+        <w:rPr>
+          <w:rFonts w:ascii="Courier New" w:hAnsi="Courier New"/>
+          <w:sz w:val="16"/>
+        </w:rPr>
+        <w:t>sambaadm --config /etc/sambaadm/config.yaml serve --debug</w:t>
+      </w:r>
+    </w:p>
+    <w:p>
+      <w:pPr>
+        <w:spacing w:after="0" w:line="240" w:lineRule="auto"/>
+      </w:pPr>
+      <w:r>
+        <w:rPr>
+          <w:rFonts w:ascii="Courier New" w:hAnsi="Courier New"/>
+          <w:sz w:val="16"/>
+        </w:rPr>
+        <w:t>sambaadm --config /etc/sambaadm/config.yaml serve --check</w:t>
+      </w:r>
+    </w:p>
+    <w:p>
+      <w:pPr>
+        <w:spacing w:after="0" w:line="240" w:lineRule="auto"/>
+      </w:pPr>
+      <w:r>
+        <w:rPr>
+          <w:rFonts w:ascii="Courier New" w:hAnsi="Courier New"/>
+          <w:sz w:val="16"/>
+        </w:rPr>
+        <w:t>journalctl -u sambaadm -b -f</w:t>
+      </w:r>
+    </w:p>
+    <w:p>
+      <w:r>
+        <w:t>Debug показывает версию, выбранную конфигурацию, адреса, пути, наличие переменной пароля и ошибки подключения. Сам пароль не выводится. При передаче журнала в поддержку проверьте его на внутренние адреса и имена. Аудит действий хранится по audit.file; включите его в политику хранения журналов.</w:t>
+      </w:r>
+    </w:p>
+    <w:p>
+      <w:r>
+        <w:t>- Страница не открывается: проверьте процесс, listening, порт, адрес и межсетевой экран. 127.0.0.1 доступен только локально.</w:t>
+      </w:r>
+    </w:p>
+    <w:p>
+      <w:r>
+        <w:t>- Вход не проходит: проверьте служебный пароль, UPN, LDAPS, CA, DNS и Base DN. Локальный пароль ОС не заменяет доменный.</w:t>
+      </w:r>
+    </w:p>
+    <w:p>
+      <w:r>
+        <w:t>- 401: войдите повторно. 403: проверьте роль и обновите сессию/форму; роль не выдаёт права AD автоматически.</w:t>
+      </w:r>
+    </w:p>
+    <w:p>
+      <w:r>
+        <w:t>- 409: перечитайте изменённый объект или файл, сравните значения и повторите действие.</w:t>
+      </w:r>
+    </w:p>
+    <w:p>
+      <w:r>
+        <w:t>- RPC или SMB недоступны: проверьте DNS DC, маршруты, соответствующие порты и права служебной записи.</w:t>
+      </w:r>
+    </w:p>
+    <w:p>
+      <w:r>
+        <w:t>- Папка не создаётся: проверьте NSS/getent, GID, setfacl, smb.conf и права сервиса.</w:t>
+      </w:r>
+    </w:p>
+    <w:p>
+      <w:r>
+        <w:t>- GPO сохранена, но не действует: проверьте ссылки, раздел Machine/User, Read и Apply, SYSVOL на целевом DC и результат обработки на клиенте.</w:t>
+      </w:r>
+    </w:p>
+    <w:p>
+      <w:r>
+        <w:t>Перед обновлением сохраните YAML, секреты в защищённом хранилище, smb.conf и резервные копии GPO. Проверьте новый бинарник и вход, чтение каталога, тестовую операцию и журнал. При проблеме верните предыдущий бинарник и конфигурацию по принятой процедуре обслуживания.</w:t>
       </w:r>
     </w:p>
     <w:sectPr>
       <w:footerReference w:type="default" r:id="rId9"/>
-      <w:pgSz w:w="11909" w:h="16834"/>
-      <w:pgMar w:top="936" w:right="1080" w:bottom="936" w:left="1080" w:header="720" w:footer="720" w:gutter="0"/>
+      <w:pgSz w:w="11906" w:h="16838"/>
+      <w:pgMar w:top="935" w:right="1080" w:bottom="935" w:left="1080" w:header="720" w:footer="720" w:gutter="0"/>
       <w:cols w:space="720"/>
       <w:docGrid w:linePitch="360"/>
     </w:sectPr>
@@ -2713,7 +1305,10 @@
       <w:jc w:val="right"/>
     </w:pPr>
     <w:r>
-      <w:t xml:space="preserve">sambaadm  •  </w:t>
+      <w:rPr>
+        <w:sz w:val="16"/>
+      </w:rPr>
+      <w:t xml:space="preserve">sambaadm  |  </w:t>
     </w:r>
     <w:fldSimple w:instr="PAGE"/>
   </w:p>
@@ -3084,7 +1679,7 @@
     <w:qFormat/>
     <w:rsid w:val="00FC693F"/>
     <w:pPr>
-      <w:spacing w:after="140" w:line="264" w:lineRule="auto"/>
+      <w:spacing w:after="140" w:line="259" w:lineRule="auto"/>
     </w:pPr>
     <w:rPr>
       <w:rFonts w:ascii="Arial" w:hAnsi="Arial"/>
@@ -3472,15 +2067,14 @@
       <w:numPr>
         <w:ilvl w:val="1"/>
       </w:numPr>
-      <w:spacing w:after="140"/>
     </w:pPr>
     <w:rPr>
-      <w:rFonts w:asciiTheme="majorHAnsi" w:eastAsiaTheme="majorEastAsia" w:hAnsiTheme="majorHAnsi" w:cstheme="majorBidi" w:ascii="Arial" w:hAnsi="Arial"/>
+      <w:rFonts w:asciiTheme="majorHAnsi" w:eastAsiaTheme="majorEastAsia" w:hAnsiTheme="majorHAnsi" w:cstheme="majorBidi"/>
       <w:i/>
       <w:iCs/>
-      <w:color w:val="000000"/>
+      <w:color w:val="4F81BD" w:themeColor="accent1"/>
       <w:spacing w:val="15"/>
-      <w:sz w:val="26"/>
+      <w:sz w:val="24"/>
       <w:szCs w:val="24"/>
     </w:rPr>
   </w:style>
@@ -3877,12 +2471,13 @@
     <w:qFormat/>
     <w:rsid w:val="00FC693F"/>
     <w:pPr>
-      <w:spacing w:line="240" w:lineRule="auto"/>
+      <w:spacing w:line="240" w:lineRule="auto" w:after="140"/>
     </w:pPr>
     <w:rPr>
+      <w:rFonts w:ascii="Arial" w:hAnsi="Arial"/>
       <w:b/>
       <w:bCs/>
-      <w:color w:val="4F81BD" w:themeColor="accent1"/>
+      <w:color w:val="000000"/>
       <w:sz w:val="18"/>
       <w:szCs w:val="18"/>
     </w:rPr>
@@ -3918,6 +2513,9 @@
     <w:qFormat/>
     <w:rsid w:val="00FC693F"/>
     <w:pPr>
+      <w:pBdr>
+        <w:bottom w:val="single" w:sz="4" w:space="4" w:color="4F81BD" w:themeColor="accent1"/>
+      </w:pBdr>
       <w:spacing w:before="200" w:after="280"/>
       <w:ind w:left="936" w:right="936"/>
     </w:pPr>

</xml_diff>

<commit_message>
feat: model resultant ALT policies and highlight GPO conflicts
</commit_message>
<xml_diff>
--- a/docs/admin-guide/sambaadm-admin-guide.docx
+++ b/docs/admin-guide/sambaadm-admin-guide.docx
@@ -12,7 +12,7 @@
     </w:p>
     <w:p>
       <w:r>
-        <w:t>Редакция от 21 октября 2026 года для текущей ветки main и сборки v0.23.0-dev. Последний опубликованный релиз v0.22.0 не включает новые область действия GPO, фильтрацию безопасности, мастер папок, профили Samba и графики нагрузки.</w:t>
+        <w:t>Редакция от 27 октября 2026 года для текущей ветки main и сборки v0.23.0-dev. Последний опубликованный релиз v0.22.0 не включает новые область действия GPO, фильтрацию безопасности, мастер папок, профили Samba и графики нагрузки.</w:t>
       </w:r>
     </w:p>
     <w:p>
@@ -65,27 +65,27 @@
     </w:p>
     <w:p>
       <w:r>
-        <w:t>9  Фильтрация и резервные копии GPO</w:t>
+        <w:t>10  Фильтрация и резервные копии GPO</w:t>
       </w:r>
     </w:p>
     <w:p>
       <w:r>
-        <w:t>10  Сайты и карта репликации</w:t>
+        <w:t>11  Сайты и карта репликации</w:t>
       </w:r>
     </w:p>
     <w:p>
       <w:r>
-        <w:t>11  Общие папки и доменные группы</w:t>
+        <w:t>12  Общие папки и доменные группы</w:t>
       </w:r>
     </w:p>
     <w:p>
       <w:r>
-        <w:t>12  Профили Samba и показатели системы</w:t>
+        <w:t>13  Профили Samba и показатели системы</w:t>
       </w:r>
     </w:p>
     <w:p>
       <w:r>
-        <w:t>13  Обслуживание и диагностика</w:t>
+        <w:t>14  Обслуживание и диагностика</w:t>
       </w:r>
     </w:p>
     <w:p>
@@ -878,6 +878,56 @@
     </w:p>
     <w:p>
       <w:pPr>
+        <w:pStyle w:val="Heading2"/>
+      </w:pPr>
+      <w:r>
+        <w:t>Моделирование результирующей политики ALT и Windows</w:t>
+      </w:r>
+    </w:p>
+    <w:p>
+      <w:pPr/>
+      <w:r>
+        <w:t>В разделе GPO выберите «Моделирование политики». Расчёт доступен readonly, helpdesk и admin, читает LDAP и SYSVOL и не изменяет объекты или настройки. Требуются включённый gpo.editor_enabled, шаблоны ALT ADMX/ADML и SMB-доступ к SYSVOL, как для редактора ALT.</w:t>
+      </w:r>
+    </w:p>
+    <w:p>
+      <w:pPr/>
+      <w:r>
+        <w:t>Выберите пользователя и/или компьютер либо домен/OU для условного получателя. Дополнительная OU моделирует перенос без изменения каталога. Loopback задаётся явно: None, Merge или Replace. Для Merge/Replace нужны оба получателя; в Merge пользовательские параметры из расположения компьютера имеют более высокий приоритет.</w:t>
+      </w:r>
+    </w:p>
+    <w:p>
+      <w:pPr/>
+      <w:r>
+        <w:t>Задайте допущения безопасности и WMI для всех GPO или отдельно по GUID политики. «Разрешено / истина» включает право применения и чтение GPO/SYSVOL; «Запрещено / ложь» исключает политику. По умолчанию условия неизвестны: GPO исключается, а раздел помечается как неполный. Эти условия общие для Machine и User; членство в группах, ACL и WMI на клиенте автоматически не проверяются.</w:t>
+      </w:r>
+    </w:p>
+    <w:p>
+      <w:pPr/>
+      <w:r>
+        <w:t>Нажмите «Рассчитать результат». Отчёт учитывает ссылки домена/OU, порядок, Enforced, блокировку наследования, отключённые ссылки и разделы. Итоговые состояния и значения ALT вычисляются из Registry.pol по шаблонам ADMX/ADML; источниками разных значений одного параметра могут быть разные GPO. Ненастроенный параметр в одной GPO не отменяет значение другой.</w:t>
+      </w:r>
+    </w:p>
+    <w:p>
+      <w:pPr/>
+      <w:r>
+        <w:t>Строки с разными значениями одного параметра реестра выделены цветом и подписью «Конфликт». Сведения о конфликте показывают конкурирующие значения, победившую GPO, контейнер, Enforced и порядок ссылки. Установка и удаление значения также конфликтуют; одинаковые значения разных GPO не подсвечиваются. Раскройте Registry.pol для параметров без шаблона ALT.</w:t>
+      </w:r>
+    </w:p>
+    <w:p>
+      <w:pPr/>
+      <w:r>
+        <w:t>Скачайте отчёт JSON для сохранения сценария, допущений, источников и конфликтов. После изменения сценария старый отчёт скрывается: запустите расчёт снова. Ошибки чтения, неизвестные условия и неподдерживаемые директивы дают неполный результат; победители в нём могут измениться после устранения причин.</w:t>
+      </w:r>
+    </w:p>
+    <w:p>
+      <w:pPr/>
+      <w:r>
+        <w:t>Это ограниченная модель RSoP. Политики сайта и локальные политики, скрипты, Preferences, security templates, медленные соединения и остальные клиентские расширения не вычисляются. Поддержка loopback и фактическое применение зависят от движка ALT/Windows-клиента. Проверяйте результат на тестовом клиенте. Подробности и формат API: docs/web.md и docs/api.md.</w:t>
+      </w:r>
+    </w:p>
+    <w:p>
+      <w:pPr>
         <w:pStyle w:val="Heading1"/>
         <w:pageBreakBefore/>
       </w:pPr>

</xml_diff>